<commit_message>
Actualizar TFG con nuevos capitulos y diagramas
</commit_message>
<xml_diff>
--- a/entregas/Capitulo3.docx
+++ b/entregas/Capitulo3.docx
@@ -247,7 +247,6 @@
             <w:pPr>
               <w:jc w:val="both"/>
             </w:pPr>
-            <w:proofErr w:type="spellStart"/>
             <w:r>
               <w:rPr>
                 <w:b/>
@@ -255,7 +254,6 @@
               </w:rPr>
               <w:t>Estilo</w:t>
             </w:r>
-            <w:proofErr w:type="spellEnd"/>
           </w:p>
         </w:tc>
         <w:tc>
@@ -329,28 +327,12 @@
               <w:spacing w:after="0"/>
               <w:jc w:val="both"/>
             </w:pPr>
-            <w:proofErr w:type="spellStart"/>
-            <w:r>
-              <w:rPr>
-                <w:sz w:val="20"/>
-              </w:rPr>
-              <w:t>Monolito</w:t>
-            </w:r>
-            <w:proofErr w:type="spellEnd"/>
-            <w:r>
-              <w:rPr>
-                <w:sz w:val="20"/>
-              </w:rPr>
-              <w:t xml:space="preserve"> MVC </w:t>
-            </w:r>
-            <w:proofErr w:type="spellStart"/>
-            <w:r>
-              <w:rPr>
-                <w:sz w:val="20"/>
-              </w:rPr>
-              <w:t>tradicional</w:t>
-            </w:r>
-            <w:proofErr w:type="spellEnd"/>
+            <w:r>
+              <w:rPr>
+                <w:sz w:val="20"/>
+              </w:rPr>
+              <w:t>Monolito MVC tradicional</w:t>
+            </w:r>
           </w:p>
         </w:tc>
         <w:tc>
@@ -423,14 +405,12 @@
               <w:spacing w:after="0"/>
               <w:jc w:val="both"/>
             </w:pPr>
-            <w:proofErr w:type="spellStart"/>
             <w:r>
               <w:rPr>
                 <w:sz w:val="20"/>
               </w:rPr>
               <w:t>Microservicios</w:t>
             </w:r>
-            <w:proofErr w:type="spellEnd"/>
           </w:p>
         </w:tc>
         <w:tc>
@@ -504,19 +484,11 @@
               <w:spacing w:after="0"/>
               <w:jc w:val="both"/>
             </w:pPr>
-            <w:proofErr w:type="spellStart"/>
-            <w:r>
-              <w:rPr>
-                <w:sz w:val="20"/>
-              </w:rPr>
-              <w:t>Cliente-servidor</w:t>
-            </w:r>
-            <w:proofErr w:type="spellEnd"/>
-            <w:r>
-              <w:rPr>
-                <w:sz w:val="20"/>
-              </w:rPr>
-              <w:t xml:space="preserve"> con API REST</w:t>
+            <w:r>
+              <w:rPr>
+                <w:sz w:val="20"/>
+              </w:rPr>
+              <w:t>Cliente-servidor con API REST</w:t>
             </w:r>
           </w:p>
         </w:tc>
@@ -1086,7 +1058,7 @@
           <w:noProof/>
         </w:rPr>
         <w:drawing>
-          <wp:inline distT="0" distB="0" distL="0" distR="0" wp14:anchorId="6040EFD4" wp14:editId="363D8915">
+          <wp:inline distT="0" distB="0" distL="0" distR="0" wp14:anchorId="00750F18" wp14:editId="25D0A905">
             <wp:extent cx="5897880" cy="5735071"/>
             <wp:effectExtent l="0" t="0" r="0" b="0"/>
             <wp:docPr id="1" name="Picture 1"/>
@@ -1718,7 +1690,7 @@
         </w:rPr>
         <w:lastRenderedPageBreak/>
         <w:drawing>
-          <wp:inline distT="0" distB="0" distL="0" distR="0" wp14:anchorId="71C0C823" wp14:editId="0BCADAEF">
+          <wp:inline distT="0" distB="0" distL="0" distR="0" wp14:anchorId="50F0D91E" wp14:editId="42C630FF">
             <wp:extent cx="6172200" cy="4892598"/>
             <wp:effectExtent l="0" t="0" r="0" b="0"/>
             <wp:docPr id="2" name="Picture 2"/>
@@ -1833,15 +1805,7 @@
         <w:jc w:val="both"/>
       </w:pPr>
       <w:r>
-        <w:t xml:space="preserve">El catálogo traduce números </w:t>
-      </w:r>
-      <w:proofErr w:type="gramStart"/>
-      <w:r>
-        <w:t>1..</w:t>
-      </w:r>
-      <w:proofErr w:type="gramEnd"/>
-      <w:r>
-        <w:t>7 y sinónimos a un servicio oficial.</w:t>
+        <w:t>El catálogo traduce números 1..7 y sinónimos a un servicio oficial.</w:t>
       </w:r>
     </w:p>
     <w:p>
@@ -1894,7 +1858,7 @@
         </w:rPr>
         <w:lastRenderedPageBreak/>
         <w:drawing>
-          <wp:inline distT="0" distB="0" distL="0" distR="0" wp14:anchorId="003DABD0" wp14:editId="58F50BC0">
+          <wp:inline distT="0" distB="0" distL="0" distR="0" wp14:anchorId="485287BE" wp14:editId="212E6D73">
             <wp:extent cx="6172200" cy="3371703"/>
             <wp:effectExtent l="0" t="0" r="0" b="0"/>
             <wp:docPr id="3" name="Picture 3"/>
@@ -2036,7 +2000,7 @@
         </w:rPr>
         <w:lastRenderedPageBreak/>
         <w:drawing>
-          <wp:inline distT="0" distB="0" distL="0" distR="0" wp14:anchorId="4BD09FA4" wp14:editId="1D89251B">
+          <wp:inline distT="0" distB="0" distL="0" distR="0" wp14:anchorId="0D299E10" wp14:editId="10A171A8">
             <wp:extent cx="6172200" cy="3616613"/>
             <wp:effectExtent l="0" t="0" r="0" b="0"/>
             <wp:docPr id="4" name="Picture 4"/>
@@ -2178,7 +2142,7 @@
         </w:rPr>
         <w:lastRenderedPageBreak/>
         <w:drawing>
-          <wp:inline distT="0" distB="0" distL="0" distR="0" wp14:anchorId="31613E13" wp14:editId="7A971A64">
+          <wp:inline distT="0" distB="0" distL="0" distR="0" wp14:anchorId="1C91E318" wp14:editId="23C1D7E0">
             <wp:extent cx="6172200" cy="4863176"/>
             <wp:effectExtent l="0" t="0" r="0" b="0"/>
             <wp:docPr id="5" name="Picture 5"/>
@@ -2320,7 +2284,7 @@
         </w:rPr>
         <w:lastRenderedPageBreak/>
         <w:drawing>
-          <wp:inline distT="0" distB="0" distL="0" distR="0" wp14:anchorId="11DC7713" wp14:editId="51D0DA69">
+          <wp:inline distT="0" distB="0" distL="0" distR="0" wp14:anchorId="5E838324" wp14:editId="764AE2F4">
             <wp:extent cx="6172200" cy="5472855"/>
             <wp:effectExtent l="0" t="0" r="0" b="0"/>
             <wp:docPr id="6" name="Picture 6"/>
@@ -2397,7 +2361,7 @@
         </w:rPr>
         <w:lastRenderedPageBreak/>
         <w:drawing>
-          <wp:inline distT="0" distB="0" distL="0" distR="0" wp14:anchorId="5457C50F" wp14:editId="462FC543">
+          <wp:inline distT="0" distB="0" distL="0" distR="0" wp14:anchorId="31F1938B" wp14:editId="1BB5FA5D">
             <wp:extent cx="6172200" cy="2833341"/>
             <wp:effectExtent l="0" t="0" r="0" b="0"/>
             <wp:docPr id="7" name="Picture 7"/>
@@ -4339,7 +4303,7 @@
           <w:noProof/>
         </w:rPr>
         <w:drawing>
-          <wp:inline distT="0" distB="0" distL="0" distR="0" wp14:anchorId="31AF7C00" wp14:editId="3434CB9D">
+          <wp:inline distT="0" distB="0" distL="0" distR="0" wp14:anchorId="2F528479" wp14:editId="0BB0E2C3">
             <wp:extent cx="6172200" cy="3275132"/>
             <wp:effectExtent l="0" t="0" r="0" b="0"/>
             <wp:docPr id="8" name="Picture 8"/>
@@ -5010,8 +4974,8 @@
         </w:rPr>
         <w:lastRenderedPageBreak/>
         <w:drawing>
-          <wp:inline distT="0" distB="0" distL="0" distR="0" wp14:anchorId="6874280A" wp14:editId="4B30F7F3">
-            <wp:extent cx="6263640" cy="7268813"/>
+          <wp:inline distT="0" distB="0" distL="0" distR="0" wp14:anchorId="1BF80D49" wp14:editId="16227713">
+            <wp:extent cx="6263640" cy="7211016"/>
             <wp:effectExtent l="0" t="0" r="0" b="0"/>
             <wp:docPr id="9" name="Picture 9"/>
             <wp:cNvGraphicFramePr>
@@ -5033,7 +4997,7 @@
                   <pic:spPr>
                     <a:xfrm>
                       <a:off x="0" y="0"/>
-                      <a:ext cx="6263640" cy="7268813"/>
+                      <a:ext cx="6263640" cy="7211016"/>
                     </a:xfrm>
                     <a:prstGeom prst="rect">
                       <a:avLst/>
@@ -5568,7 +5532,7 @@
           <w:noProof/>
         </w:rPr>
         <w:drawing>
-          <wp:inline distT="0" distB="0" distL="0" distR="0" wp14:anchorId="30A509D5" wp14:editId="46770114">
+          <wp:inline distT="0" distB="0" distL="0" distR="0" wp14:anchorId="433EC74E" wp14:editId="5A70C60A">
             <wp:extent cx="4114800" cy="5077476"/>
             <wp:effectExtent l="0" t="0" r="0" b="0"/>
             <wp:docPr id="10" name="Picture 10"/>
@@ -6380,7 +6344,7 @@
         </w:rPr>
         <w:lastRenderedPageBreak/>
         <w:drawing>
-          <wp:inline distT="0" distB="0" distL="0" distR="0" wp14:anchorId="5E7127CB" wp14:editId="3610742F">
+          <wp:inline distT="0" distB="0" distL="0" distR="0" wp14:anchorId="336A4B25" wp14:editId="0FD1984C">
             <wp:extent cx="3794760" cy="6803277"/>
             <wp:effectExtent l="0" t="0" r="0" b="0"/>
             <wp:docPr id="11" name="Picture 11"/>
@@ -9040,7 +9004,7 @@
         <w:jc w:val="both"/>
       </w:pPr>
       <w:r>
-        <w:t>En la implementación JavaScript, una clase de diseño puede materializarse como clase, esquema Mongoose, controlador Express, servicio exportado o módulo de configuración. El diagrama resume los módulos principales y deja las relaciones detalladas en la tabla posterior para evitar un esquema excesivamente cargado.</w:t>
+        <w:t>En la implementación JavaScript, una clase de diseño puede materializarse como clase, esquema Mongoose, controlador Express, servicio exportado o módulo de configuración. La Figura 3.12 resume los módulos reales del backend que intervienen en la reserva y en la sincronización del catálogo. Las flechas discontinuas representan uso de módulos o paso de información; por eso ServiceCatalogService y ServiceModel aparecen separados del flujo conversacional: sincronizan y exponen el catálogo público de MongoDB, pero no participan en cada turno del chatbot.</w:t>
       </w:r>
     </w:p>
     <w:p>
@@ -9052,20 +9016,17 @@
         <w:rPr>
           <w:noProof/>
         </w:rPr>
-        <w:lastRenderedPageBreak/>
         <w:drawing>
-          <wp:inline distT="0" distB="0" distL="0" distR="0" wp14:anchorId="3045F5F5" wp14:editId="06F98B67">
-            <wp:extent cx="5715000" cy="5064336"/>
-            <wp:effectExtent l="0" t="0" r="0" b="0"/>
-            <wp:docPr id="12" name="Picture 12"/>
-            <wp:cNvGraphicFramePr>
-              <a:graphicFrameLocks xmlns:a="http://schemas.openxmlformats.org/drawingml/2006/main" noChangeAspect="1"/>
-            </wp:cNvGraphicFramePr>
+          <wp:inline distT="0" distB="0" distL="0" distR="0" wp14:anchorId="76CC4484" wp14:editId="156D82E7">
+            <wp:extent cx="6126480" cy="2952711"/>
+            <wp:effectExtent l="0" t="0" r="7620" b="0"/>
+            <wp:docPr id="12" name="Imagen 12"/>
+            <wp:cNvGraphicFramePr/>
             <a:graphic xmlns:a="http://schemas.openxmlformats.org/drawingml/2006/main">
               <a:graphicData uri="http://schemas.openxmlformats.org/drawingml/2006/picture">
                 <pic:pic xmlns:pic="http://schemas.openxmlformats.org/drawingml/2006/picture">
                   <pic:nvPicPr>
-                    <pic:cNvPr id="0" name="12_modulos_backend.png"/>
+                    <pic:cNvPr id="12" name=""/>
                     <pic:cNvPicPr/>
                   </pic:nvPicPr>
                   <pic:blipFill>
@@ -9077,7 +9038,7 @@
                   <pic:spPr>
                     <a:xfrm>
                       <a:off x="0" y="0"/>
-                      <a:ext cx="5715000" cy="5064336"/>
+                      <a:ext cx="6126480" cy="2952711"/>
                     </a:xfrm>
                     <a:prstGeom prst="rect">
                       <a:avLst/>
@@ -9096,12 +9057,7 @@
         <w:jc w:val="center"/>
       </w:pPr>
       <w:r>
-        <w:rPr>
-          <w:i/>
-          <w:color w:val="5A5A5A"/>
-          <w:sz w:val="21"/>
-        </w:rPr>
-        <w:t>Figura 3.12. Módulos principales del backend.</w:t>
+        <w:t>Figura 3.12. Diseño simplificado de clases y módulos del backend de reserva.</w:t>
       </w:r>
     </w:p>
     <w:tbl>
@@ -9134,12 +9090,12 @@
           </w:tcPr>
           <w:p>
             <w:pPr>
-              <w:jc w:val="both"/>
+              <w:spacing w:after="40"/>
             </w:pPr>
             <w:r>
               <w:rPr>
                 <w:b/>
-                <w:sz w:val="19"/>
+                <w:sz w:val="18"/>
               </w:rPr>
               <w:t>Módulo</w:t>
             </w:r>
@@ -9159,12 +9115,12 @@
           </w:tcPr>
           <w:p>
             <w:pPr>
-              <w:jc w:val="both"/>
+              <w:spacing w:after="40"/>
             </w:pPr>
             <w:r>
               <w:rPr>
                 <w:b/>
-                <w:sz w:val="19"/>
+                <w:sz w:val="18"/>
               </w:rPr>
               <w:t>Responsabilidad</w:t>
             </w:r>
@@ -9184,12 +9140,12 @@
           </w:tcPr>
           <w:p>
             <w:pPr>
-              <w:jc w:val="both"/>
+              <w:spacing w:after="40"/>
             </w:pPr>
             <w:r>
               <w:rPr>
                 <w:b/>
-                <w:sz w:val="19"/>
+                <w:sz w:val="18"/>
               </w:rPr>
               <w:t>Principio aplicado</w:t>
             </w:r>
@@ -9213,14 +9169,14 @@
           </w:tcPr>
           <w:p>
             <w:pPr>
-              <w:spacing w:after="0"/>
-              <w:jc w:val="both"/>
-            </w:pPr>
-            <w:r>
-              <w:rPr>
-                <w:sz w:val="19"/>
-              </w:rPr>
-              <w:t>appointmentService</w:t>
+              <w:spacing w:after="40"/>
+            </w:pPr>
+            <w:r>
+              <w:rPr>
+                <w:sz w:val="18"/>
+              </w:rPr>
+              <w:lastRenderedPageBreak/>
+              <w:t>serviceCatalog.js / SERVICE_CATALOG</w:t>
             </w:r>
           </w:p>
         </w:tc>
@@ -9237,14 +9193,13 @@
           </w:tcPr>
           <w:p>
             <w:pPr>
-              <w:spacing w:after="0"/>
-              <w:jc w:val="both"/>
-            </w:pPr>
-            <w:r>
-              <w:rPr>
-                <w:sz w:val="19"/>
-              </w:rPr>
-              <w:t>CRUD, validación de fecha/hora, estados, solapes y estadísticas.</w:t>
+              <w:spacing w:after="40"/>
+            </w:pPr>
+            <w:r>
+              <w:rPr>
+                <w:sz w:val="18"/>
+              </w:rPr>
+              <w:t>Define las siete opciones oficiales, resuelve servicios por texto u opción numérica y genera la lista numerada.</w:t>
             </w:r>
           </w:p>
         </w:tc>
@@ -9261,14 +9216,13 @@
           </w:tcPr>
           <w:p>
             <w:pPr>
-              <w:spacing w:after="0"/>
-              <w:jc w:val="both"/>
-            </w:pPr>
-            <w:r>
-              <w:rPr>
-                <w:sz w:val="19"/>
-              </w:rPr>
-              <w:t>Alta cohesión: toda regla crítica de agenda está en un punto.</w:t>
+              <w:spacing w:after="40"/>
+            </w:pPr>
+            <w:r>
+              <w:rPr>
+                <w:sz w:val="18"/>
+              </w:rPr>
+              <w:t>Fuente única de catálogo para prompt, validación y sincronización.</w:t>
             </w:r>
           </w:p>
         </w:tc>
@@ -9291,14 +9245,13 @@
           </w:tcPr>
           <w:p>
             <w:pPr>
-              <w:spacing w:after="0"/>
-              <w:jc w:val="both"/>
-            </w:pPr>
-            <w:r>
-              <w:rPr>
-                <w:sz w:val="19"/>
-              </w:rPr>
-              <w:t>bookingFlowService</w:t>
+              <w:spacing w:after="40"/>
+            </w:pPr>
+            <w:r>
+              <w:rPr>
+                <w:sz w:val="18"/>
+              </w:rPr>
+              <w:t>promptService</w:t>
             </w:r>
           </w:p>
         </w:tc>
@@ -9316,14 +9269,13 @@
           </w:tcPr>
           <w:p>
             <w:pPr>
-              <w:spacing w:after="0"/>
-              <w:jc w:val="both"/>
-            </w:pPr>
-            <w:r>
-              <w:rPr>
-                <w:sz w:val="19"/>
-              </w:rPr>
-              <w:t>Extraer contexto conversacional y decidir la siguiente pregunta o confirmación.</w:t>
+              <w:spacing w:after="40"/>
+            </w:pPr>
+            <w:r>
+              <w:rPr>
+                <w:sz w:val="18"/>
+              </w:rPr>
+              <w:t>Construye el system prompt y los mensajes de chat con calendario, hora actual, historial y catálogo.</w:t>
             </w:r>
           </w:p>
         </w:tc>
@@ -9341,14 +9293,13 @@
           </w:tcPr>
           <w:p>
             <w:pPr>
-              <w:spacing w:after="0"/>
-              <w:jc w:val="both"/>
-            </w:pPr>
-            <w:r>
-              <w:rPr>
-                <w:sz w:val="19"/>
-              </w:rPr>
-              <w:t>Responsabilidad única del flujo de reserva.</w:t>
+              <w:spacing w:after="40"/>
+            </w:pPr>
+            <w:r>
+              <w:rPr>
+                <w:sz w:val="18"/>
+              </w:rPr>
+              <w:t>Separa la preparación del prompt respecto al controlador.</w:t>
             </w:r>
           </w:p>
         </w:tc>
@@ -9370,14 +9321,13 @@
           </w:tcPr>
           <w:p>
             <w:pPr>
-              <w:spacing w:after="0"/>
-              <w:jc w:val="both"/>
-            </w:pPr>
-            <w:r>
-              <w:rPr>
-                <w:sz w:val="19"/>
-              </w:rPr>
-              <w:t>chatRuleService</w:t>
+              <w:spacing w:after="40"/>
+            </w:pPr>
+            <w:r>
+              <w:rPr>
+                <w:sz w:val="18"/>
+              </w:rPr>
+              <w:t>lmStudioService</w:t>
             </w:r>
           </w:p>
         </w:tc>
@@ -9394,14 +9344,13 @@
           </w:tcPr>
           <w:p>
             <w:pPr>
-              <w:spacing w:after="0"/>
-              <w:jc w:val="both"/>
-            </w:pPr>
-            <w:r>
-              <w:rPr>
-                <w:sz w:val="19"/>
-              </w:rPr>
-              <w:t>Responder preflight a horarios, servicios, fines de semana y números inválidos.</w:t>
+              <w:spacing w:after="40"/>
+            </w:pPr>
+            <w:r>
+              <w:rPr>
+                <w:sz w:val="18"/>
+              </w:rPr>
+              <w:t>Encapsula la llamada HTTP al servidor local de LM Studio, con timeout y error controlado.</w:t>
             </w:r>
           </w:p>
         </w:tc>
@@ -9418,14 +9367,13 @@
           </w:tcPr>
           <w:p>
             <w:pPr>
-              <w:spacing w:after="0"/>
-              <w:jc w:val="both"/>
-            </w:pPr>
-            <w:r>
-              <w:rPr>
-                <w:sz w:val="19"/>
-              </w:rPr>
-              <w:t>Evita depender del LLM para reglas deterministas.</w:t>
+              <w:spacing w:after="40"/>
+            </w:pPr>
+            <w:r>
+              <w:rPr>
+                <w:sz w:val="18"/>
+              </w:rPr>
+              <w:t>Adaptador sustituible para el proveedor local de IA.</w:t>
             </w:r>
           </w:p>
         </w:tc>
@@ -9448,14 +9396,13 @@
           </w:tcPr>
           <w:p>
             <w:pPr>
-              <w:spacing w:after="0"/>
-              <w:jc w:val="both"/>
-            </w:pPr>
-            <w:r>
-              <w:rPr>
-                <w:sz w:val="19"/>
-              </w:rPr>
-              <w:t>promptService</w:t>
+              <w:spacing w:after="40"/>
+            </w:pPr>
+            <w:r>
+              <w:rPr>
+                <w:sz w:val="18"/>
+              </w:rPr>
+              <w:t>responseParserService</w:t>
             </w:r>
           </w:p>
         </w:tc>
@@ -9473,14 +9420,13 @@
           </w:tcPr>
           <w:p>
             <w:pPr>
-              <w:spacing w:after="0"/>
-              <w:jc w:val="both"/>
-            </w:pPr>
-            <w:r>
-              <w:rPr>
-                <w:sz w:val="19"/>
-              </w:rPr>
-              <w:t>Construir system prompt con calendario, hora actual y catálogo.</w:t>
+              <w:spacing w:after="40"/>
+            </w:pPr>
+            <w:r>
+              <w:rPr>
+                <w:sz w:val="18"/>
+              </w:rPr>
+              <w:t>Separa la respuesta visible para el cliente del posible JSON de cita generado por la IA.</w:t>
             </w:r>
           </w:p>
         </w:tc>
@@ -9498,14 +9444,13 @@
           </w:tcPr>
           <w:p>
             <w:pPr>
-              <w:spacing w:after="0"/>
-              <w:jc w:val="both"/>
-            </w:pPr>
-            <w:r>
-              <w:rPr>
-                <w:sz w:val="19"/>
-              </w:rPr>
-              <w:t>Separación del prompt respecto al controlador.</w:t>
+              <w:spacing w:after="40"/>
+            </w:pPr>
+            <w:r>
+              <w:rPr>
+                <w:sz w:val="18"/>
+              </w:rPr>
+              <w:t>Aísla el parseo del lenguaje natural.</w:t>
             </w:r>
           </w:p>
         </w:tc>
@@ -9527,14 +9472,13 @@
           </w:tcPr>
           <w:p>
             <w:pPr>
-              <w:spacing w:after="0"/>
-              <w:jc w:val="both"/>
-            </w:pPr>
-            <w:r>
-              <w:rPr>
-                <w:sz w:val="19"/>
-              </w:rPr>
-              <w:t>lmStudioService</w:t>
+              <w:spacing w:after="40"/>
+            </w:pPr>
+            <w:r>
+              <w:rPr>
+                <w:sz w:val="18"/>
+              </w:rPr>
+              <w:t>bookingFlowService</w:t>
             </w:r>
           </w:p>
         </w:tc>
@@ -9551,14 +9495,13 @@
           </w:tcPr>
           <w:p>
             <w:pPr>
-              <w:spacing w:after="0"/>
-              <w:jc w:val="both"/>
-            </w:pPr>
-            <w:r>
-              <w:rPr>
-                <w:sz w:val="19"/>
-              </w:rPr>
-              <w:t>Adaptador HTTP a LM Studio con timeout y error controlado.</w:t>
+              <w:spacing w:after="40"/>
+            </w:pPr>
+            <w:r>
+              <w:rPr>
+                <w:sz w:val="18"/>
+              </w:rPr>
+              <w:t>Extrae nombre, servicio, fecha y hora del historial y confirma reservas deterministas cuando los datos están completos.</w:t>
             </w:r>
           </w:p>
         </w:tc>
@@ -9575,14 +9518,13 @@
           </w:tcPr>
           <w:p>
             <w:pPr>
-              <w:spacing w:after="0"/>
-              <w:jc w:val="both"/>
-            </w:pPr>
-            <w:r>
-              <w:rPr>
-                <w:sz w:val="19"/>
-              </w:rPr>
-              <w:t>Indirección: se puede sustituir el proveedor local.</w:t>
+              <w:spacing w:after="40"/>
+            </w:pPr>
+            <w:r>
+              <w:rPr>
+                <w:sz w:val="18"/>
+              </w:rPr>
+              <w:t>Responsabilidad única del flujo conversacional de reserva.</w:t>
             </w:r>
           </w:p>
         </w:tc>
@@ -9605,14 +9547,13 @@
           </w:tcPr>
           <w:p>
             <w:pPr>
-              <w:spacing w:after="0"/>
-              <w:jc w:val="both"/>
-            </w:pPr>
-            <w:r>
-              <w:rPr>
-                <w:sz w:val="19"/>
-              </w:rPr>
-              <w:t>responseParserService</w:t>
+              <w:spacing w:after="40"/>
+            </w:pPr>
+            <w:r>
+              <w:rPr>
+                <w:sz w:val="18"/>
+              </w:rPr>
+              <w:t>appointmentService</w:t>
             </w:r>
           </w:p>
         </w:tc>
@@ -9630,14 +9571,13 @@
           </w:tcPr>
           <w:p>
             <w:pPr>
-              <w:spacing w:after="0"/>
-              <w:jc w:val="both"/>
-            </w:pPr>
-            <w:r>
-              <w:rPr>
-                <w:sz w:val="19"/>
-              </w:rPr>
-              <w:t>Separar respuesta natural y JSON de confirmación.</w:t>
+              <w:spacing w:after="40"/>
+            </w:pPr>
+            <w:r>
+              <w:rPr>
+                <w:sz w:val="18"/>
+              </w:rPr>
+              <w:t>Lista, consulta, crea, actualiza, elimina y calcula estadísticas de citas; valida nombre, servicio, horario, fecha futura y solapes.</w:t>
             </w:r>
           </w:p>
         </w:tc>
@@ -9655,14 +9595,13 @@
           </w:tcPr>
           <w:p>
             <w:pPr>
-              <w:spacing w:after="0"/>
-              <w:jc w:val="both"/>
-            </w:pPr>
-            <w:r>
-              <w:rPr>
-                <w:sz w:val="19"/>
-              </w:rPr>
-              <w:t>Aísla el parseo del lenguaje natural.</w:t>
+              <w:spacing w:after="40"/>
+            </w:pPr>
+            <w:r>
+              <w:rPr>
+                <w:sz w:val="18"/>
+              </w:rPr>
+              <w:t>Alta cohesión: toda regla crítica de agenda está en un punto.</w:t>
             </w:r>
           </w:p>
         </w:tc>
@@ -9684,14 +9623,12 @@
           </w:tcPr>
           <w:p>
             <w:pPr>
-              <w:spacing w:after="0"/>
-              <w:jc w:val="both"/>
-            </w:pPr>
-            <w:r>
-              <w:rPr>
-                <w:sz w:val="19"/>
-              </w:rPr>
-              <w:lastRenderedPageBreak/>
+              <w:spacing w:after="40"/>
+            </w:pPr>
+            <w:r>
+              <w:rPr>
+                <w:sz w:val="18"/>
+              </w:rPr>
               <w:t>calendarService</w:t>
             </w:r>
           </w:p>
@@ -9709,14 +9646,13 @@
           </w:tcPr>
           <w:p>
             <w:pPr>
-              <w:spacing w:after="0"/>
-              <w:jc w:val="both"/>
-            </w:pPr>
-            <w:r>
-              <w:rPr>
-                <w:sz w:val="19"/>
-              </w:rPr>
-              <w:t>Fechas relativas, horario de Madrid y detección de fin de semana.</w:t>
+              <w:spacing w:after="40"/>
+            </w:pPr>
+            <w:r>
+              <w:rPr>
+                <w:sz w:val="18"/>
+              </w:rPr>
+              <w:t>Centraliza fecha/hora de Madrid, días laborables, fines de semana y formatos de fecha usados por chat y agenda.</w:t>
             </w:r>
           </w:p>
         </w:tc>
@@ -9733,14 +9669,119 @@
           </w:tcPr>
           <w:p>
             <w:pPr>
-              <w:spacing w:after="0"/>
-              <w:jc w:val="both"/>
-            </w:pPr>
-            <w:r>
-              <w:rPr>
-                <w:sz w:val="19"/>
-              </w:rPr>
-              <w:t>Centraliza lógica temporal.</w:t>
+              <w:spacing w:after="40"/>
+            </w:pPr>
+            <w:r>
+              <w:rPr>
+                <w:sz w:val="18"/>
+              </w:rPr>
+              <w:t>Evita duplicar lógica temporal.</w:t>
+            </w:r>
+          </w:p>
+        </w:tc>
+      </w:tr>
+      <w:tr>
+        <w:trPr>
+          <w:jc w:val="center"/>
+        </w:trPr>
+        <w:tc>
+          <w:tcPr>
+            <w:tcW w:w="2376" w:type="dxa"/>
+          </w:tcPr>
+          <w:p>
+            <w:pPr>
+              <w:spacing w:after="40"/>
+            </w:pPr>
+            <w:r>
+              <w:rPr>
+                <w:sz w:val="18"/>
+              </w:rPr>
+              <w:t>serviceCatalogService</w:t>
+            </w:r>
+          </w:p>
+        </w:tc>
+        <w:tc>
+          <w:tcPr>
+            <w:tcW w:w="4968" w:type="dxa"/>
+          </w:tcPr>
+          <w:p>
+            <w:pPr>
+              <w:spacing w:after="40"/>
+            </w:pPr>
+            <w:r>
+              <w:rPr>
+                <w:sz w:val="18"/>
+              </w:rPr>
+              <w:t>Sincroniza SERVICE_CATALOG con la colección servicios y expone el catálogo público a la API.</w:t>
+            </w:r>
+          </w:p>
+        </w:tc>
+        <w:tc>
+          <w:tcPr>
+            <w:tcW w:w="2520" w:type="dxa"/>
+          </w:tcPr>
+          <w:p>
+            <w:pPr>
+              <w:spacing w:after="40"/>
+            </w:pPr>
+            <w:r>
+              <w:rPr>
+                <w:sz w:val="18"/>
+              </w:rPr>
+              <w:t>Mantiene coherencia entre prompt, frontend y MongoDB.</w:t>
+            </w:r>
+          </w:p>
+        </w:tc>
+      </w:tr>
+      <w:tr>
+        <w:trPr>
+          <w:jc w:val="center"/>
+        </w:trPr>
+        <w:tc>
+          <w:tcPr>
+            <w:tcW w:w="2376" w:type="dxa"/>
+          </w:tcPr>
+          <w:p>
+            <w:pPr>
+              <w:spacing w:after="40"/>
+            </w:pPr>
+            <w:r>
+              <w:rPr>
+                <w:sz w:val="18"/>
+              </w:rPr>
+              <w:t>adminService</w:t>
+            </w:r>
+          </w:p>
+        </w:tc>
+        <w:tc>
+          <w:tcPr>
+            <w:tcW w:w="4968" w:type="dxa"/>
+          </w:tcPr>
+          <w:p>
+            <w:pPr>
+              <w:spacing w:after="40"/>
+            </w:pPr>
+            <w:r>
+              <w:rPr>
+                <w:sz w:val="18"/>
+              </w:rPr>
+              <w:t>Prepara la cuenta inicial, autentica al administrador y obtiene la sesión desde JWT.</w:t>
+            </w:r>
+          </w:p>
+        </w:tc>
+        <w:tc>
+          <w:tcPr>
+            <w:tcW w:w="2520" w:type="dxa"/>
+          </w:tcPr>
+          <w:p>
+            <w:pPr>
+              <w:spacing w:after="40"/>
+            </w:pPr>
+            <w:r>
+              <w:rPr>
+                <w:sz w:val="18"/>
+              </w:rPr>
+              <w:t>Separa seguridad y credenciales de controladores y database.js.</w:t>
             </w:r>
           </w:p>
         </w:tc>
@@ -9759,9 +9800,9 @@
         <w:tblLook w:val="04A0" w:firstRow="1" w:lastRow="0" w:firstColumn="1" w:lastColumn="0" w:noHBand="0" w:noVBand="1"/>
       </w:tblPr>
       <w:tblGrid>
-        <w:gridCol w:w="3683"/>
-        <w:gridCol w:w="2685"/>
-        <w:gridCol w:w="3496"/>
+        <w:gridCol w:w="3210"/>
+        <w:gridCol w:w="2777"/>
+        <w:gridCol w:w="3877"/>
       </w:tblGrid>
       <w:tr>
         <w:trPr>
@@ -9781,12 +9822,12 @@
           </w:tcPr>
           <w:p>
             <w:pPr>
-              <w:jc w:val="both"/>
+              <w:spacing w:after="40"/>
             </w:pPr>
             <w:r>
               <w:rPr>
                 <w:b/>
-                <w:sz w:val="19"/>
+                <w:sz w:val="18"/>
               </w:rPr>
               <w:t>Relación</w:t>
             </w:r>
@@ -9806,12 +9847,12 @@
           </w:tcPr>
           <w:p>
             <w:pPr>
-              <w:jc w:val="both"/>
+              <w:spacing w:after="40"/>
             </w:pPr>
             <w:r>
               <w:rPr>
                 <w:b/>
-                <w:sz w:val="19"/>
+                <w:sz w:val="18"/>
               </w:rPr>
               <w:t>Tipo</w:t>
             </w:r>
@@ -9831,12 +9872,12 @@
           </w:tcPr>
           <w:p>
             <w:pPr>
-              <w:jc w:val="both"/>
+              <w:spacing w:after="40"/>
             </w:pPr>
             <w:r>
               <w:rPr>
                 <w:b/>
-                <w:sz w:val="19"/>
+                <w:sz w:val="18"/>
               </w:rPr>
               <w:t>Detalle</w:t>
             </w:r>
@@ -9860,10 +9901,13 @@
           </w:tcPr>
           <w:p>
             <w:pPr>
-              <w:jc w:val="both"/>
-            </w:pPr>
-            <w:r>
-              <w:t>Conversacion -&gt; Mensaje</w:t>
+              <w:spacing w:after="40"/>
+            </w:pPr>
+            <w:r>
+              <w:rPr>
+                <w:sz w:val="18"/>
+              </w:rPr>
+              <w:t>promptService -&gt; serviceCatalog.js</w:t>
             </w:r>
           </w:p>
         </w:tc>
@@ -9880,10 +9924,13 @@
           </w:tcPr>
           <w:p>
             <w:pPr>
-              <w:jc w:val="both"/>
-            </w:pPr>
-            <w:r>
-              <w:t>Composición 1 -&gt; *</w:t>
+              <w:spacing w:after="40"/>
+            </w:pPr>
+            <w:r>
+              <w:rPr>
+                <w:sz w:val="18"/>
+              </w:rPr>
+              <w:t>Dependencia</w:t>
             </w:r>
           </w:p>
         </w:tc>
@@ -9900,10 +9947,13 @@
           </w:tcPr>
           <w:p>
             <w:pPr>
-              <w:jc w:val="both"/>
-            </w:pPr>
-            <w:r>
-              <w:t>Los mensajes forman parte del historial de una conversación y se interpretan dentro de ese contexto.</w:t>
+              <w:spacing w:after="40"/>
+            </w:pPr>
+            <w:r>
+              <w:rPr>
+                <w:sz w:val="18"/>
+              </w:rPr>
+              <w:t>Usa formatNumberedServices() para insertar en el prompt las opciones 1..7.</w:t>
             </w:r>
           </w:p>
         </w:tc>
@@ -9926,10 +9976,13 @@
           </w:tcPr>
           <w:p>
             <w:pPr>
-              <w:jc w:val="both"/>
-            </w:pPr>
-            <w:r>
-              <w:t>CatalogoServicios -&gt; Servicio</w:t>
+              <w:spacing w:after="40"/>
+            </w:pPr>
+            <w:r>
+              <w:rPr>
+                <w:sz w:val="18"/>
+              </w:rPr>
+              <w:t>bookingFlowService -&gt; serviceCatalog.js</w:t>
             </w:r>
           </w:p>
         </w:tc>
@@ -9947,10 +10000,13 @@
           </w:tcPr>
           <w:p>
             <w:pPr>
-              <w:jc w:val="both"/>
-            </w:pPr>
-            <w:r>
-              <w:t>Agregación 1 -&gt; 7</w:t>
+              <w:spacing w:after="40"/>
+            </w:pPr>
+            <w:r>
+              <w:rPr>
+                <w:sz w:val="18"/>
+              </w:rPr>
+              <w:t>Dependencia</w:t>
             </w:r>
           </w:p>
         </w:tc>
@@ -9968,10 +10024,13 @@
           </w:tcPr>
           <w:p>
             <w:pPr>
-              <w:jc w:val="both"/>
-            </w:pPr>
-            <w:r>
-              <w:t>El catálogo agrupa las siete opciones oficiales que también usa el prompt y valida el backend.</w:t>
+              <w:spacing w:after="40"/>
+            </w:pPr>
+            <w:r>
+              <w:rPr>
+                <w:sz w:val="18"/>
+              </w:rPr>
+              <w:t>Usa getServiceByOption(), resolveService() y normalizeText() para interpretar el servicio del cliente.</w:t>
             </w:r>
           </w:p>
         </w:tc>
@@ -9993,10 +10052,13 @@
           </w:tcPr>
           <w:p>
             <w:pPr>
-              <w:jc w:val="both"/>
-            </w:pPr>
-            <w:r>
-              <w:t>Agenda -&gt; Cita</w:t>
+              <w:spacing w:after="40"/>
+            </w:pPr>
+            <w:r>
+              <w:rPr>
+                <w:sz w:val="18"/>
+              </w:rPr>
+              <w:t>bookingFlowService -&gt; calendarService</w:t>
             </w:r>
           </w:p>
         </w:tc>
@@ -10013,10 +10075,13 @@
           </w:tcPr>
           <w:p>
             <w:pPr>
-              <w:jc w:val="both"/>
-            </w:pPr>
-            <w:r>
-              <w:t>Agregación 1 -&gt; *</w:t>
+              <w:spacing w:after="40"/>
+            </w:pPr>
+            <w:r>
+              <w:rPr>
+                <w:sz w:val="18"/>
+              </w:rPr>
+              <w:t>Dependencia</w:t>
             </w:r>
           </w:p>
         </w:tc>
@@ -10033,10 +10098,13 @@
           </w:tcPr>
           <w:p>
             <w:pPr>
-              <w:jc w:val="both"/>
-            </w:pPr>
-            <w:r>
-              <w:t>La agenda organiza citas y aplica reglas de horario, estados y solapes.</w:t>
+              <w:spacing w:after="40"/>
+            </w:pPr>
+            <w:r>
+              <w:rPr>
+                <w:sz w:val="18"/>
+              </w:rPr>
+              <w:t>Interpreta fechas relativas, bloquea fines de semana y formatea la fecha de confirmación.</w:t>
             </w:r>
           </w:p>
         </w:tc>
@@ -10059,10 +10127,13 @@
           </w:tcPr>
           <w:p>
             <w:pPr>
-              <w:jc w:val="both"/>
-            </w:pPr>
-            <w:r>
-              <w:t>Cita -&gt; Servicio</w:t>
+              <w:spacing w:after="40"/>
+            </w:pPr>
+            <w:r>
+              <w:rPr>
+                <w:sz w:val="18"/>
+              </w:rPr>
+              <w:t>bookingFlowService -&gt; appointmentService</w:t>
             </w:r>
           </w:p>
         </w:tc>
@@ -10080,10 +10151,13 @@
           </w:tcPr>
           <w:p>
             <w:pPr>
-              <w:jc w:val="both"/>
-            </w:pPr>
-            <w:r>
-              <w:t>Asociación * -&gt; 1</w:t>
+              <w:spacing w:after="40"/>
+            </w:pPr>
+            <w:r>
+              <w:rPr>
+                <w:sz w:val="18"/>
+              </w:rPr>
+              <w:t>Dependencia</w:t>
             </w:r>
           </w:p>
         </w:tc>
@@ -10101,10 +10175,13 @@
           </w:tcPr>
           <w:p>
             <w:pPr>
-              <w:jc w:val="both"/>
-            </w:pPr>
-            <w:r>
-              <w:t>Cada cita queda asociada al servicio elegido; el precio y la duración se guardan en la reserva.</w:t>
+              <w:spacing w:after="40"/>
+            </w:pPr>
+            <w:r>
+              <w:rPr>
+                <w:sz w:val="18"/>
+              </w:rPr>
+              <w:t>Cuando reúne nombre, servicio, fecha y hora, crea o actualiza la cita.</w:t>
             </w:r>
           </w:p>
         </w:tc>
@@ -10126,9 +10203,12 @@
           </w:tcPr>
           <w:p>
             <w:pPr>
-              <w:jc w:val="both"/>
-            </w:pPr>
-            <w:r>
+              <w:spacing w:after="40"/>
+            </w:pPr>
+            <w:r>
+              <w:rPr>
+                <w:sz w:val="18"/>
+              </w:rPr>
               <w:t>chatController -&gt; bookingFlowService</w:t>
             </w:r>
           </w:p>
@@ -10146,10 +10226,13 @@
           </w:tcPr>
           <w:p>
             <w:pPr>
-              <w:jc w:val="both"/>
-            </w:pPr>
-            <w:r>
-              <w:t>Dependencia</w:t>
+              <w:spacing w:after="40"/>
+            </w:pPr>
+            <w:r>
+              <w:rPr>
+                <w:sz w:val="18"/>
+              </w:rPr>
+              <w:t>Orquestación</w:t>
             </w:r>
           </w:p>
         </w:tc>
@@ -10166,10 +10249,13 @@
           </w:tcPr>
           <w:p>
             <w:pPr>
-              <w:jc w:val="both"/>
-            </w:pPr>
-            <w:r>
-              <w:t>El controlador delega primero en el flujo determinista de reserva.</w:t>
+              <w:spacing w:after="40"/>
+            </w:pPr>
+            <w:r>
+              <w:rPr>
+                <w:sz w:val="18"/>
+              </w:rPr>
+              <w:t>El controlador intenta primero resolver el flujo determinista de reserva.</w:t>
             </w:r>
           </w:p>
         </w:tc>
@@ -10192,9 +10278,12 @@
           </w:tcPr>
           <w:p>
             <w:pPr>
-              <w:jc w:val="both"/>
-            </w:pPr>
-            <w:r>
+              <w:spacing w:after="40"/>
+            </w:pPr>
+            <w:r>
+              <w:rPr>
+                <w:sz w:val="18"/>
+              </w:rPr>
               <w:t>chatController -&gt; chatRuleService</w:t>
             </w:r>
           </w:p>
@@ -10213,10 +10302,13 @@
           </w:tcPr>
           <w:p>
             <w:pPr>
-              <w:jc w:val="both"/>
-            </w:pPr>
-            <w:r>
-              <w:t>Dependencia</w:t>
+              <w:spacing w:after="40"/>
+            </w:pPr>
+            <w:r>
+              <w:rPr>
+                <w:sz w:val="18"/>
+              </w:rPr>
+              <w:t>Orquestación</w:t>
             </w:r>
           </w:p>
         </w:tc>
@@ -10234,10 +10326,13 @@
           </w:tcPr>
           <w:p>
             <w:pPr>
-              <w:jc w:val="both"/>
-            </w:pPr>
-            <w:r>
-              <w:t>Aplica reglas previas para horarios, servicios, números inválidos y fines de semana.</w:t>
+              <w:spacing w:after="40"/>
+            </w:pPr>
+            <w:r>
+              <w:rPr>
+                <w:sz w:val="18"/>
+              </w:rPr>
+              <w:t>Aplica reglas previas de horario, servicios, fines de semana y selección numérica inválida.</w:t>
             </w:r>
           </w:p>
         </w:tc>
@@ -10259,10 +10354,13 @@
           </w:tcPr>
           <w:p>
             <w:pPr>
-              <w:jc w:val="both"/>
-            </w:pPr>
-            <w:r>
-              <w:t>chatController -&gt; lmStudioService</w:t>
+              <w:spacing w:after="40"/>
+            </w:pPr>
+            <w:r>
+              <w:rPr>
+                <w:sz w:val="18"/>
+              </w:rPr>
+              <w:t>chatController -&gt; prompt/lmStudio/parser</w:t>
             </w:r>
           </w:p>
         </w:tc>
@@ -10279,10 +10377,13 @@
           </w:tcPr>
           <w:p>
             <w:pPr>
-              <w:jc w:val="both"/>
-            </w:pPr>
-            <w:r>
-              <w:t>Dependencia</w:t>
+              <w:spacing w:after="40"/>
+            </w:pPr>
+            <w:r>
+              <w:rPr>
+                <w:sz w:val="18"/>
+              </w:rPr>
+              <w:t>Orquestación IA</w:t>
             </w:r>
           </w:p>
         </w:tc>
@@ -10299,10 +10400,13 @@
           </w:tcPr>
           <w:p>
             <w:pPr>
-              <w:jc w:val="both"/>
-            </w:pPr>
-            <w:r>
-              <w:t>Usa el adaptador local de IA solo cuando el flujo determinista no resuelve la conversación.</w:t>
+              <w:spacing w:after="40"/>
+            </w:pPr>
+            <w:r>
+              <w:rPr>
+                <w:sz w:val="18"/>
+              </w:rPr>
+              <w:t>Solo si no hay respuesta determinista, prepara mensajes, llama a LM Studio y parsea la respuesta.</w:t>
             </w:r>
           </w:p>
         </w:tc>
@@ -10317,10 +10421,13 @@
           </w:tcPr>
           <w:p>
             <w:pPr>
-              <w:jc w:val="both"/>
-            </w:pPr>
-            <w:r>
-              <w:t>appointmentController -&gt; appointmentService</w:t>
+              <w:spacing w:after="40"/>
+            </w:pPr>
+            <w:r>
+              <w:rPr>
+                <w:sz w:val="18"/>
+              </w:rPr>
+              <w:t>appointmentService -&gt; calendarService</w:t>
             </w:r>
           </w:p>
         </w:tc>
@@ -10330,10 +10437,13 @@
           </w:tcPr>
           <w:p>
             <w:pPr>
-              <w:jc w:val="both"/>
-            </w:pPr>
-            <w:r>
-              <w:t>Dependencia</w:t>
+              <w:spacing w:after="40"/>
+            </w:pPr>
+            <w:r>
+              <w:rPr>
+                <w:sz w:val="18"/>
+              </w:rPr>
+              <w:t>Validación</w:t>
             </w:r>
           </w:p>
         </w:tc>
@@ -10343,10 +10453,13 @@
           </w:tcPr>
           <w:p>
             <w:pPr>
-              <w:jc w:val="both"/>
-            </w:pPr>
-            <w:r>
-              <w:t>La gestión administrativa de citas se delega en el servicio de agenda.</w:t>
+              <w:spacing w:after="40"/>
+            </w:pPr>
+            <w:r>
+              <w:rPr>
+                <w:sz w:val="18"/>
+              </w:rPr>
+              <w:t>Comprueba fines de semana, hora actual y horario permitido antes de persistir.</w:t>
             </w:r>
           </w:p>
         </w:tc>
@@ -10361,10 +10474,14 @@
           </w:tcPr>
           <w:p>
             <w:pPr>
-              <w:jc w:val="both"/>
-            </w:pPr>
-            <w:r>
-              <w:t>serviceController -&gt; SERVICE_CATALOG</w:t>
+              <w:spacing w:after="40"/>
+            </w:pPr>
+            <w:r>
+              <w:rPr>
+                <w:sz w:val="18"/>
+              </w:rPr>
+              <w:lastRenderedPageBreak/>
+              <w:t>appointmentService -&gt; serviceCatalog.js</w:t>
             </w:r>
           </w:p>
         </w:tc>
@@ -10374,10 +10491,13 @@
           </w:tcPr>
           <w:p>
             <w:pPr>
-              <w:jc w:val="both"/>
-            </w:pPr>
-            <w:r>
-              <w:t>Dependencia</w:t>
+              <w:spacing w:after="40"/>
+            </w:pPr>
+            <w:r>
+              <w:rPr>
+                <w:sz w:val="18"/>
+              </w:rPr>
+              <w:t>Validación</w:t>
             </w:r>
           </w:p>
         </w:tc>
@@ -10387,10 +10507,13 @@
           </w:tcPr>
           <w:p>
             <w:pPr>
-              <w:jc w:val="both"/>
-            </w:pPr>
-            <w:r>
-              <w:t>La consulta pública de servicios sale del catálogo oficial de la aplicación.</w:t>
+              <w:spacing w:after="40"/>
+            </w:pPr>
+            <w:r>
+              <w:rPr>
+                <w:sz w:val="18"/>
+              </w:rPr>
+              <w:t>Resuelve el servicio oficial para fijar precio, duración y etiqueta guardada.</w:t>
             </w:r>
           </w:p>
         </w:tc>
@@ -10405,10 +10528,13 @@
           </w:tcPr>
           <w:p>
             <w:pPr>
-              <w:jc w:val="both"/>
-            </w:pPr>
-            <w:r>
-              <w:t>authController -&gt; Admin</w:t>
+              <w:spacing w:after="40"/>
+            </w:pPr>
+            <w:r>
+              <w:rPr>
+                <w:sz w:val="18"/>
+              </w:rPr>
+              <w:t>appointmentService -&gt; Appointment</w:t>
             </w:r>
           </w:p>
         </w:tc>
@@ -10418,10 +10544,13 @@
           </w:tcPr>
           <w:p>
             <w:pPr>
-              <w:jc w:val="both"/>
-            </w:pPr>
-            <w:r>
-              <w:t>Dependencia</w:t>
+              <w:spacing w:after="40"/>
+            </w:pPr>
+            <w:r>
+              <w:rPr>
+                <w:sz w:val="18"/>
+              </w:rPr>
+              <w:t>Persistencia</w:t>
             </w:r>
           </w:p>
         </w:tc>
@@ -10431,10 +10560,13 @@
           </w:tcPr>
           <w:p>
             <w:pPr>
-              <w:jc w:val="both"/>
-            </w:pPr>
-            <w:r>
-              <w:t>Consulta la cuenta administrativa y valida la contraseña hash durante el inicio de sesión.</w:t>
+              <w:spacing w:after="40"/>
+            </w:pPr>
+            <w:r>
+              <w:rPr>
+                <w:sz w:val="18"/>
+              </w:rPr>
+              <w:t>Consulta y modifica documentos de citas mediante Mongoose.</w:t>
             </w:r>
           </w:p>
         </w:tc>
@@ -10449,10 +10581,13 @@
           </w:tcPr>
           <w:p>
             <w:pPr>
-              <w:jc w:val="both"/>
-            </w:pPr>
-            <w:r>
-              <w:t>requireAuth -&gt; Admin</w:t>
+              <w:spacing w:after="40"/>
+            </w:pPr>
+            <w:r>
+              <w:rPr>
+                <w:sz w:val="18"/>
+              </w:rPr>
+              <w:t>appointmentController -&gt; appointmentService</w:t>
             </w:r>
           </w:p>
         </w:tc>
@@ -10462,9 +10597,12 @@
           </w:tcPr>
           <w:p>
             <w:pPr>
-              <w:jc w:val="both"/>
-            </w:pPr>
-            <w:r>
+              <w:spacing w:after="40"/>
+            </w:pPr>
+            <w:r>
+              <w:rPr>
+                <w:sz w:val="18"/>
+              </w:rPr>
               <w:t>Dependencia</w:t>
             </w:r>
           </w:p>
@@ -10475,10 +10613,13 @@
           </w:tcPr>
           <w:p>
             <w:pPr>
-              <w:jc w:val="both"/>
-            </w:pPr>
-            <w:r>
-              <w:t>Verifica el token, recupera la cuenta administrativa y adjunta el administrador a la petición.</w:t>
+              <w:spacing w:after="40"/>
+            </w:pPr>
+            <w:r>
+              <w:rPr>
+                <w:sz w:val="18"/>
+              </w:rPr>
+              <w:t>El panel administrativo delega listado, detalle, alta, edición, borrado y estadísticas.</w:t>
             </w:r>
           </w:p>
         </w:tc>
@@ -10493,10 +10634,13 @@
           </w:tcPr>
           <w:p>
             <w:pPr>
-              <w:jc w:val="both"/>
-            </w:pPr>
-            <w:r>
-              <w:t>requireAuth -&gt; appointmentController/authController</w:t>
+              <w:spacing w:after="40"/>
+            </w:pPr>
+            <w:r>
+              <w:rPr>
+                <w:sz w:val="18"/>
+              </w:rPr>
+              <w:t>authController / requireAuth -&gt; adminService -&gt; Admin</w:t>
             </w:r>
           </w:p>
         </w:tc>
@@ -10506,10 +10650,13 @@
           </w:tcPr>
           <w:p>
             <w:pPr>
-              <w:jc w:val="both"/>
-            </w:pPr>
-            <w:r>
-              <w:t>Dependencia</w:t>
+              <w:spacing w:after="40"/>
+            </w:pPr>
+            <w:r>
+              <w:rPr>
+                <w:sz w:val="18"/>
+              </w:rPr>
+              <w:t>Seguridad</w:t>
             </w:r>
           </w:p>
         </w:tc>
@@ -10519,10 +10666,13 @@
           </w:tcPr>
           <w:p>
             <w:pPr>
-              <w:jc w:val="both"/>
-            </w:pPr>
-            <w:r>
-              <w:t>Protege las rutas privadas de citas y la ruta de sesión activa /auth/me.</w:t>
+              <w:spacing w:after="40"/>
+            </w:pPr>
+            <w:r>
+              <w:rPr>
+                <w:sz w:val="18"/>
+              </w:rPr>
+              <w:t>Autentica credenciales, firma/verifica JWT y recupera la cuenta administrativa.</w:t>
             </w:r>
           </w:p>
         </w:tc>
@@ -10537,11 +10687,13 @@
           </w:tcPr>
           <w:p>
             <w:pPr>
-              <w:jc w:val="both"/>
-            </w:pPr>
-            <w:r>
-              <w:lastRenderedPageBreak/>
-              <w:t>appointmentService -&gt; Appointment</w:t>
+              <w:spacing w:after="40"/>
+            </w:pPr>
+            <w:r>
+              <w:rPr>
+                <w:sz w:val="18"/>
+              </w:rPr>
+              <w:t>server.js / serviceController -&gt; serviceCatalogService</w:t>
             </w:r>
           </w:p>
         </w:tc>
@@ -10551,10 +10703,13 @@
           </w:tcPr>
           <w:p>
             <w:pPr>
-              <w:jc w:val="both"/>
-            </w:pPr>
-            <w:r>
-              <w:t>Dependencia</w:t>
+              <w:spacing w:after="40"/>
+            </w:pPr>
+            <w:r>
+              <w:rPr>
+                <w:sz w:val="18"/>
+              </w:rPr>
+              <w:t>Catálogo</w:t>
             </w:r>
           </w:p>
         </w:tc>
@@ -10564,10 +10719,119 @@
           </w:tcPr>
           <w:p>
             <w:pPr>
-              <w:jc w:val="both"/>
-            </w:pPr>
-            <w:r>
-              <w:t>El servicio persiste, consulta y actualiza documentos de cita mediante Mongoose.</w:t>
+              <w:spacing w:after="40"/>
+            </w:pPr>
+            <w:r>
+              <w:rPr>
+                <w:sz w:val="18"/>
+              </w:rPr>
+              <w:t>server.js sincroniza servicios al arrancar y serviceController responde GET /api/services.</w:t>
+            </w:r>
+          </w:p>
+        </w:tc>
+      </w:tr>
+      <w:tr>
+        <w:trPr>
+          <w:jc w:val="center"/>
+        </w:trPr>
+        <w:tc>
+          <w:tcPr>
+            <w:tcW w:w="3683" w:type="dxa"/>
+          </w:tcPr>
+          <w:p>
+            <w:pPr>
+              <w:spacing w:after="40"/>
+            </w:pPr>
+            <w:r>
+              <w:rPr>
+                <w:sz w:val="18"/>
+              </w:rPr>
+              <w:t>serviceCatalogService -&gt; Service + SERVICE_CATALOG</w:t>
+            </w:r>
+          </w:p>
+        </w:tc>
+        <w:tc>
+          <w:tcPr>
+            <w:tcW w:w="2685" w:type="dxa"/>
+          </w:tcPr>
+          <w:p>
+            <w:pPr>
+              <w:spacing w:after="40"/>
+            </w:pPr>
+            <w:r>
+              <w:rPr>
+                <w:sz w:val="18"/>
+              </w:rPr>
+              <w:t>Sincronización</w:t>
+            </w:r>
+          </w:p>
+        </w:tc>
+        <w:tc>
+          <w:tcPr>
+            <w:tcW w:w="3496" w:type="dxa"/>
+          </w:tcPr>
+          <w:p>
+            <w:pPr>
+              <w:spacing w:after="40"/>
+            </w:pPr>
+            <w:r>
+              <w:rPr>
+                <w:sz w:val="18"/>
+              </w:rPr>
+              <w:t>Actualiza la colección servicios desde el catálogo base y la usa como respaldo si MongoDB está vacío.</w:t>
+            </w:r>
+          </w:p>
+        </w:tc>
+      </w:tr>
+      <w:tr>
+        <w:trPr>
+          <w:jc w:val="center"/>
+        </w:trPr>
+        <w:tc>
+          <w:tcPr>
+            <w:tcW w:w="3683" w:type="dxa"/>
+          </w:tcPr>
+          <w:p>
+            <w:pPr>
+              <w:spacing w:after="40"/>
+            </w:pPr>
+            <w:r>
+              <w:rPr>
+                <w:sz w:val="18"/>
+              </w:rPr>
+              <w:t>lmStudioService -&gt; env + AppError</w:t>
+            </w:r>
+          </w:p>
+        </w:tc>
+        <w:tc>
+          <w:tcPr>
+            <w:tcW w:w="2685" w:type="dxa"/>
+          </w:tcPr>
+          <w:p>
+            <w:pPr>
+              <w:spacing w:after="40"/>
+            </w:pPr>
+            <w:r>
+              <w:rPr>
+                <w:sz w:val="18"/>
+              </w:rPr>
+              <w:t>Integración local</w:t>
+            </w:r>
+          </w:p>
+        </w:tc>
+        <w:tc>
+          <w:tcPr>
+            <w:tcW w:w="3496" w:type="dxa"/>
+          </w:tcPr>
+          <w:p>
+            <w:pPr>
+              <w:spacing w:after="40"/>
+            </w:pPr>
+            <w:r>
+              <w:rPr>
+                <w:sz w:val="18"/>
+              </w:rPr>
+              <w:t>Lee URL, modelo y timeout desde env y transforma fallos de LM Studio en errores controlados.</w:t>
             </w:r>
           </w:p>
         </w:tc>
@@ -10639,7 +10903,7 @@
         <w:jc w:val="both"/>
       </w:pPr>
       <w:r>
-        <w:t>La estructura de carpetas implementa los paquetes definidos en análisis. La dirección de dependencias es estable: las rutas llaman a controladores; los controladores delegan en servicios; los servicios usan modelos y configuración; las vistas consumen la API mediante un cliente HTTP centralizado.</w:t>
+        <w:t>La estructura de carpetas implementa los paquetes definidos en análisis y refleja el código real del repositorio. La dirección de dependencias es estable: las rutas llaman a controladores; los controladores delegan en servicios; los servicios usan modelos, configuración y utilidades; las vistas React consumen la API mediante una fachada HTTP centralizada. Además, el backend separa seed y tests, de modo que la inicialización del administrador y la verificación automática no quedan mezcladas con la lógica de ejecución.</w:t>
       </w:r>
     </w:p>
     <w:p>
@@ -10648,8 +10912,8 @@
       </w:pPr>
       <w:r>
         <w:rPr>
-          <w:rFonts w:ascii="Consolas" w:eastAsia="Consolas" w:hAnsi="Consolas"/>
-          <w:sz w:val="19"/>
+          <w:rFonts w:ascii="Consolas" w:hAnsi="Consolas"/>
+          <w:sz w:val="18"/>
         </w:rPr>
         <w:t>TFG_CortePerfecto/</w:t>
       </w:r>
@@ -10660,8 +10924,8 @@
       </w:pPr>
       <w:r>
         <w:rPr>
-          <w:rFonts w:ascii="Consolas" w:eastAsia="Consolas" w:hAnsi="Consolas"/>
-          <w:sz w:val="19"/>
+          <w:rFonts w:ascii="Consolas" w:hAnsi="Consolas"/>
+          <w:sz w:val="18"/>
         </w:rPr>
         <w:t>├── frontend/</w:t>
       </w:r>
@@ -10672,8 +10936,8 @@
       </w:pPr>
       <w:r>
         <w:rPr>
-          <w:rFonts w:ascii="Consolas" w:eastAsia="Consolas" w:hAnsi="Consolas"/>
-          <w:sz w:val="19"/>
+          <w:rFonts w:ascii="Consolas" w:hAnsi="Consolas"/>
+          <w:sz w:val="18"/>
         </w:rPr>
         <w:t>│   └── src/</w:t>
       </w:r>
@@ -10684,10 +10948,10 @@
       </w:pPr>
       <w:r>
         <w:rPr>
-          <w:rFonts w:ascii="Consolas" w:eastAsia="Consolas" w:hAnsi="Consolas"/>
-          <w:sz w:val="19"/>
+          <w:rFonts w:ascii="Consolas" w:hAnsi="Consolas"/>
+          <w:sz w:val="18"/>
         </w:rPr>
-        <w:t>│       ├── components/          # Componentes reutilizables y widget de chat</w:t>
+        <w:t>│       ├── components/          # Brand, tarjetas, cabecera y ChatWidget</w:t>
       </w:r>
     </w:p>
     <w:p>
@@ -10696,10 +10960,10 @@
       </w:pPr>
       <w:r>
         <w:rPr>
-          <w:rFonts w:ascii="Consolas" w:eastAsia="Consolas" w:hAnsi="Consolas"/>
-          <w:sz w:val="19"/>
+          <w:rFonts w:ascii="Consolas" w:hAnsi="Consolas"/>
+          <w:sz w:val="18"/>
         </w:rPr>
-        <w:t>│       ├── components/admin/    # Formulario de cita del panel</w:t>
+        <w:t>│       ├── components/admin/    # AppointmentForm del panel privado</w:t>
       </w:r>
     </w:p>
     <w:p>
@@ -10708,10 +10972,10 @@
       </w:pPr>
       <w:r>
         <w:rPr>
-          <w:rFonts w:ascii="Consolas" w:eastAsia="Consolas" w:hAnsi="Consolas"/>
-          <w:sz w:val="19"/>
+          <w:rFonts w:ascii="Consolas" w:hAnsi="Consolas"/>
+          <w:sz w:val="18"/>
         </w:rPr>
-        <w:t>│       ├── context/             # AuthContext y sesión del administrador</w:t>
+        <w:t>│       ├── context/             # AuthContext y sesión JWT</w:t>
       </w:r>
     </w:p>
     <w:p>
@@ -10720,10 +10984,10 @@
       </w:pPr>
       <w:r>
         <w:rPr>
-          <w:rFonts w:ascii="Consolas" w:eastAsia="Consolas" w:hAnsi="Consolas"/>
-          <w:sz w:val="19"/>
+          <w:rFonts w:ascii="Consolas" w:hAnsi="Consolas"/>
+          <w:sz w:val="18"/>
         </w:rPr>
-        <w:t>│       ├── data/                # Datos estáticos de la web pública</w:t>
+        <w:t>│       ├── data/                # Datos estáticos de servicios, combos y contacto</w:t>
       </w:r>
     </w:p>
     <w:p>
@@ -10732,10 +10996,10 @@
       </w:pPr>
       <w:r>
         <w:rPr>
-          <w:rFonts w:ascii="Consolas" w:eastAsia="Consolas" w:hAnsi="Consolas"/>
-          <w:sz w:val="19"/>
+          <w:rFonts w:ascii="Consolas" w:hAnsi="Consolas"/>
+          <w:sz w:val="18"/>
         </w:rPr>
-        <w:t>│       ├── pages/               # HomePage y AdminLogin</w:t>
+        <w:t>│       ├── pages/               # HomePage pública</w:t>
       </w:r>
     </w:p>
     <w:p>
@@ -10744,10 +11008,10 @@
       </w:pPr>
       <w:r>
         <w:rPr>
-          <w:rFonts w:ascii="Consolas" w:eastAsia="Consolas" w:hAnsi="Consolas"/>
-          <w:sz w:val="19"/>
+          <w:rFonts w:ascii="Consolas" w:hAnsi="Consolas"/>
+          <w:sz w:val="18"/>
         </w:rPr>
-        <w:t>│       ├── pages/admin/         # Dashboard, gestión y creación de citas</w:t>
+        <w:t>│       ├── pages/admin/         # Login, layout, dashboard, citas y alta manual</w:t>
       </w:r>
     </w:p>
     <w:p>
@@ -10756,8 +11020,8 @@
       </w:pPr>
       <w:r>
         <w:rPr>
-          <w:rFonts w:ascii="Consolas" w:eastAsia="Consolas" w:hAnsi="Consolas"/>
-          <w:sz w:val="19"/>
+          <w:rFonts w:ascii="Consolas" w:hAnsi="Consolas"/>
+          <w:sz w:val="18"/>
         </w:rPr>
         <w:t>│       ├── services/            # api.js, fachada Axios</w:t>
       </w:r>
@@ -10768,8 +11032,8 @@
       </w:pPr>
       <w:r>
         <w:rPr>
-          <w:rFonts w:ascii="Consolas" w:eastAsia="Consolas" w:hAnsi="Consolas"/>
-          <w:sz w:val="19"/>
+          <w:rFonts w:ascii="Consolas" w:hAnsi="Consolas"/>
+          <w:sz w:val="18"/>
         </w:rPr>
         <w:t>│       ├── styles/              # CSS global</w:t>
       </w:r>
@@ -10780,8 +11044,8 @@
       </w:pPr>
       <w:r>
         <w:rPr>
-          <w:rFonts w:ascii="Consolas" w:eastAsia="Consolas" w:hAnsi="Consolas"/>
-          <w:sz w:val="19"/>
+          <w:rFonts w:ascii="Consolas" w:hAnsi="Consolas"/>
+          <w:sz w:val="18"/>
         </w:rPr>
         <w:t>│       └── utils/               # Formateo de fechas y moneda</w:t>
       </w:r>
@@ -10792,8 +11056,8 @@
       </w:pPr>
       <w:r>
         <w:rPr>
-          <w:rFonts w:ascii="Consolas" w:eastAsia="Consolas" w:hAnsi="Consolas"/>
-          <w:sz w:val="19"/>
+          <w:rFonts w:ascii="Consolas" w:hAnsi="Consolas"/>
+          <w:sz w:val="18"/>
         </w:rPr>
         <w:t>├── backend/</w:t>
       </w:r>
@@ -10804,10 +11068,10 @@
       </w:pPr>
       <w:r>
         <w:rPr>
-          <w:rFonts w:ascii="Consolas" w:eastAsia="Consolas" w:hAnsi="Consolas"/>
-          <w:sz w:val="19"/>
+          <w:rFonts w:ascii="Consolas" w:hAnsi="Consolas"/>
+          <w:sz w:val="18"/>
         </w:rPr>
-        <w:t>│   └── src/</w:t>
+        <w:t>│   ├── src/</w:t>
       </w:r>
     </w:p>
     <w:p>
@@ -10816,10 +11080,10 @@
       </w:pPr>
       <w:r>
         <w:rPr>
-          <w:rFonts w:ascii="Consolas" w:eastAsia="Consolas" w:hAnsi="Consolas"/>
-          <w:sz w:val="19"/>
+          <w:rFonts w:ascii="Consolas" w:hAnsi="Consolas"/>
+          <w:sz w:val="18"/>
         </w:rPr>
-        <w:t>│       ├── config/              # env, database, serviceCatalog</w:t>
+        <w:t>│   │   ├── config/              # env, database, serviceCatalog</w:t>
       </w:r>
     </w:p>
     <w:p>
@@ -10828,10 +11092,10 @@
       </w:pPr>
       <w:r>
         <w:rPr>
-          <w:rFonts w:ascii="Consolas" w:eastAsia="Consolas" w:hAnsi="Consolas"/>
-          <w:sz w:val="19"/>
+          <w:rFonts w:ascii="Consolas" w:hAnsi="Consolas"/>
+          <w:sz w:val="18"/>
         </w:rPr>
-        <w:t>│       ├── controllers/         # auth, chat, appointments, services, health</w:t>
+        <w:t>│   │   ├── controllers/         # auth, chat, appointments, services, health</w:t>
       </w:r>
     </w:p>
     <w:p>
@@ -10840,10 +11104,11 @@
       </w:pPr>
       <w:r>
         <w:rPr>
-          <w:rFonts w:ascii="Consolas" w:eastAsia="Consolas" w:hAnsi="Consolas"/>
-          <w:sz w:val="19"/>
+          <w:rFonts w:ascii="Consolas" w:hAnsi="Consolas"/>
+          <w:sz w:val="18"/>
         </w:rPr>
-        <w:t>│       ├── middleware/          # JWT, errores</w:t>
+        <w:lastRenderedPageBreak/>
+        <w:t>│   │   ├── middleware/          # requireAuth y errores</w:t>
       </w:r>
     </w:p>
     <w:p>
@@ -10852,10 +11117,10 @@
       </w:pPr>
       <w:r>
         <w:rPr>
-          <w:rFonts w:ascii="Consolas" w:eastAsia="Consolas" w:hAnsi="Consolas"/>
-          <w:sz w:val="19"/>
+          <w:rFonts w:ascii="Consolas" w:hAnsi="Consolas"/>
+          <w:sz w:val="18"/>
         </w:rPr>
-        <w:t>│       ├── models/              # Admin, Appointment</w:t>
+        <w:t>│   │   ├── models/              # Admin, Appointment, Service</w:t>
       </w:r>
     </w:p>
     <w:p>
@@ -10864,10 +11129,10 @@
       </w:pPr>
       <w:r>
         <w:rPr>
-          <w:rFonts w:ascii="Consolas" w:eastAsia="Consolas" w:hAnsi="Consolas"/>
-          <w:sz w:val="19"/>
+          <w:rFonts w:ascii="Consolas" w:hAnsi="Consolas"/>
+          <w:sz w:val="18"/>
         </w:rPr>
-        <w:t>│       ├── routes/              # Rutas REST Express</w:t>
+        <w:t>│   │   ├── routes/              # Rutas REST Express</w:t>
       </w:r>
     </w:p>
     <w:p>
@@ -10876,10 +11141,10 @@
       </w:pPr>
       <w:r>
         <w:rPr>
-          <w:rFonts w:ascii="Consolas" w:eastAsia="Consolas" w:hAnsi="Consolas"/>
-          <w:sz w:val="19"/>
+          <w:rFonts w:ascii="Consolas" w:hAnsi="Consolas"/>
+          <w:sz w:val="18"/>
         </w:rPr>
-        <w:t>│       ├── services/            # Reglas de negocio e integración</w:t>
+        <w:t>│   │   ├── seed/                # Preparación del administrador inicial</w:t>
       </w:r>
     </w:p>
     <w:p>
@@ -10888,10 +11153,10 @@
       </w:pPr>
       <w:r>
         <w:rPr>
-          <w:rFonts w:ascii="Consolas" w:eastAsia="Consolas" w:hAnsi="Consolas"/>
-          <w:sz w:val="19"/>
+          <w:rFonts w:ascii="Consolas" w:hAnsi="Consolas"/>
+          <w:sz w:val="18"/>
         </w:rPr>
-        <w:t>│       ├── utils/               # AppError, asyncHandler</w:t>
+        <w:t>│   │   ├── services/            # Negocio, IA local, catálogo y calendario</w:t>
       </w:r>
     </w:p>
     <w:p>
@@ -10900,10 +11165,10 @@
       </w:pPr>
       <w:r>
         <w:rPr>
-          <w:rFonts w:ascii="Consolas" w:eastAsia="Consolas" w:hAnsi="Consolas"/>
-          <w:sz w:val="19"/>
+          <w:rFonts w:ascii="Consolas" w:hAnsi="Consolas"/>
+          <w:sz w:val="18"/>
         </w:rPr>
-        <w:t>│       ├── app.js               # Configuración Express</w:t>
+        <w:t>│   │   ├── utils/               # AppError, asyncHandler</w:t>
       </w:r>
     </w:p>
     <w:p>
@@ -10912,10 +11177,10 @@
       </w:pPr>
       <w:r>
         <w:rPr>
-          <w:rFonts w:ascii="Consolas" w:eastAsia="Consolas" w:hAnsi="Consolas"/>
-          <w:sz w:val="19"/>
+          <w:rFonts w:ascii="Consolas" w:hAnsi="Consolas"/>
+          <w:sz w:val="18"/>
         </w:rPr>
-        <w:t>│       └── server.js            # Bootstrap Node + MongoDB</w:t>
+        <w:t>│   │   └── app.js / server.js   # Configuración Express y arranque Node</w:t>
       </w:r>
     </w:p>
     <w:p>
@@ -10924,13 +11189,39 @@
       </w:pPr>
       <w:r>
         <w:rPr>
-          <w:rFonts w:ascii="Consolas" w:eastAsia="Consolas" w:hAnsi="Consolas"/>
-          <w:sz w:val="19"/>
+          <w:rFonts w:ascii="Consolas" w:hAnsi="Consolas"/>
+          <w:sz w:val="18"/>
         </w:rPr>
-        <w:t>└── plantuml/                    # Diagramas de la memoria</w:t>
+        <w:t>│   └── tests/                   # calendarService, bookingFlowService, appointmentService</w:t>
       </w:r>
     </w:p>
-    <w:p/>
+    <w:p>
+      <w:pPr>
+        <w:rPr>
+          <w:rFonts w:ascii="Consolas" w:hAnsi="Consolas"/>
+          <w:sz w:val="18"/>
+        </w:rPr>
+      </w:pPr>
+      <w:r>
+        <w:rPr>
+          <w:rFonts w:ascii="Consolas" w:hAnsi="Consolas"/>
+          <w:sz w:val="18"/>
+        </w:rPr>
+        <w:t>├── diagramas/                   # Fuentes PlantUML, capturas e imágenes</w:t>
+      </w:r>
+    </w:p>
+    <w:p>
+      <w:pPr>
+        <w:jc w:val="both"/>
+      </w:pPr>
+      <w:r>
+        <w:rPr>
+          <w:rFonts w:ascii="Consolas" w:hAnsi="Consolas"/>
+          <w:sz w:val="18"/>
+        </w:rPr>
+        <w:t>└── RUP/ y entregas/             # Trazabilidad y documentos finales</w:t>
+      </w:r>
+    </w:p>
     <w:tbl>
       <w:tblPr>
         <w:tblStyle w:val="Tablaconcuadrcula"/>
@@ -10939,9 +11230,9 @@
         <w:tblLook w:val="04A0" w:firstRow="1" w:lastRow="0" w:firstColumn="1" w:lastColumn="0" w:noHBand="0" w:noVBand="1"/>
       </w:tblPr>
       <w:tblGrid>
-        <w:gridCol w:w="2449"/>
-        <w:gridCol w:w="4031"/>
-        <w:gridCol w:w="3384"/>
+        <w:gridCol w:w="2552"/>
+        <w:gridCol w:w="3984"/>
+        <w:gridCol w:w="3328"/>
       </w:tblGrid>
       <w:tr>
         <w:trPr>
@@ -10961,12 +11252,12 @@
           </w:tcPr>
           <w:p>
             <w:pPr>
-              <w:jc w:val="both"/>
+              <w:spacing w:after="40"/>
             </w:pPr>
             <w:r>
               <w:rPr>
                 <w:b/>
-                <w:sz w:val="19"/>
+                <w:sz w:val="18"/>
               </w:rPr>
               <w:t>Paquete físico</w:t>
             </w:r>
@@ -10986,12 +11277,12 @@
           </w:tcPr>
           <w:p>
             <w:pPr>
-              <w:jc w:val="both"/>
+              <w:spacing w:after="40"/>
             </w:pPr>
             <w:r>
               <w:rPr>
                 <w:b/>
-                <w:sz w:val="19"/>
+                <w:sz w:val="18"/>
               </w:rPr>
               <w:t>Contenido real</w:t>
             </w:r>
@@ -11011,12 +11302,12 @@
           </w:tcPr>
           <w:p>
             <w:pPr>
-              <w:jc w:val="both"/>
+              <w:spacing w:after="40"/>
             </w:pPr>
             <w:r>
               <w:rPr>
                 <w:b/>
-                <w:sz w:val="19"/>
+                <w:sz w:val="18"/>
               </w:rPr>
               <w:t>Criterio de cohesión</w:t>
             </w:r>
@@ -11040,14 +11331,13 @@
           </w:tcPr>
           <w:p>
             <w:pPr>
-              <w:spacing w:after="0"/>
-              <w:jc w:val="both"/>
-            </w:pPr>
-            <w:r>
-              <w:rPr>
-                <w:sz w:val="19"/>
-              </w:rPr>
-              <w:t>frontend/src/components</w:t>
+              <w:spacing w:after="40"/>
+            </w:pPr>
+            <w:r>
+              <w:rPr>
+                <w:sz w:val="18"/>
+              </w:rPr>
+              <w:t>frontend/src/components y components/admin</w:t>
             </w:r>
           </w:p>
         </w:tc>
@@ -11064,14 +11354,13 @@
           </w:tcPr>
           <w:p>
             <w:pPr>
-              <w:spacing w:after="0"/>
-              <w:jc w:val="both"/>
-            </w:pPr>
-            <w:r>
-              <w:rPr>
-                <w:sz w:val="19"/>
-              </w:rPr>
-              <w:t>Brand, ChatWidget, ServiceCard, ComboCard, SiteHeader.</w:t>
+              <w:spacing w:after="40"/>
+            </w:pPr>
+            <w:r>
+              <w:rPr>
+                <w:sz w:val="18"/>
+              </w:rPr>
+              <w:t>Brand, ChatWidget, ServiceCard, ComboCard, SiteHeader y AppointmentForm.</w:t>
             </w:r>
           </w:p>
         </w:tc>
@@ -11088,14 +11377,13 @@
           </w:tcPr>
           <w:p>
             <w:pPr>
-              <w:spacing w:after="0"/>
-              <w:jc w:val="both"/>
-            </w:pPr>
-            <w:r>
-              <w:rPr>
-                <w:sz w:val="19"/>
-              </w:rPr>
-              <w:t>Componentes reutilizables sin conocimiento de persistencia.</w:t>
+              <w:spacing w:after="40"/>
+            </w:pPr>
+            <w:r>
+              <w:rPr>
+                <w:sz w:val="18"/>
+              </w:rPr>
+              <w:t>Componentes reutilizables sin acceso directo a persistencia.</w:t>
             </w:r>
           </w:p>
         </w:tc>
@@ -11118,15 +11406,13 @@
           </w:tcPr>
           <w:p>
             <w:pPr>
-              <w:spacing w:after="0"/>
-              <w:jc w:val="both"/>
-            </w:pPr>
-            <w:r>
-              <w:rPr>
-                <w:sz w:val="19"/>
-              </w:rPr>
-              <w:lastRenderedPageBreak/>
-              <w:t>frontend/src/pages</w:t>
+              <w:spacing w:after="40"/>
+            </w:pPr>
+            <w:r>
+              <w:rPr>
+                <w:sz w:val="18"/>
+              </w:rPr>
+              <w:t>frontend/src/pages y pages/admin</w:t>
             </w:r>
           </w:p>
         </w:tc>
@@ -11144,14 +11430,13 @@
           </w:tcPr>
           <w:p>
             <w:pPr>
-              <w:spacing w:after="0"/>
-              <w:jc w:val="both"/>
-            </w:pPr>
-            <w:r>
-              <w:rPr>
-                <w:sz w:val="19"/>
-              </w:rPr>
-              <w:t>HomePage, AdminLogin y páginas admin.</w:t>
+              <w:spacing w:after="40"/>
+            </w:pPr>
+            <w:r>
+              <w:rPr>
+                <w:sz w:val="18"/>
+              </w:rPr>
+              <w:t>HomePage; AdminLogin, AdminLayout, AdminDashboard, AdminAppointments y AdminCreateAppointment.</w:t>
             </w:r>
           </w:p>
         </w:tc>
@@ -11169,14 +11454,13 @@
           </w:tcPr>
           <w:p>
             <w:pPr>
-              <w:spacing w:after="0"/>
-              <w:jc w:val="both"/>
-            </w:pPr>
-            <w:r>
-              <w:rPr>
-                <w:sz w:val="19"/>
-              </w:rPr>
-              <w:t>Pantallas asociadas a navegación.</w:t>
+              <w:spacing w:after="40"/>
+            </w:pPr>
+            <w:r>
+              <w:rPr>
+                <w:sz w:val="18"/>
+              </w:rPr>
+              <w:t>Pantallas asociadas a navegación pública o privada.</w:t>
             </w:r>
           </w:p>
         </w:tc>
@@ -11198,14 +11482,13 @@
           </w:tcPr>
           <w:p>
             <w:pPr>
-              <w:spacing w:after="0"/>
-              <w:jc w:val="both"/>
-            </w:pPr>
-            <w:r>
-              <w:rPr>
-                <w:sz w:val="19"/>
-              </w:rPr>
-              <w:t>frontend/src/services</w:t>
+              <w:spacing w:after="40"/>
+            </w:pPr>
+            <w:r>
+              <w:rPr>
+                <w:sz w:val="18"/>
+              </w:rPr>
+              <w:t>frontend/src/context, services, data, styles y utils</w:t>
             </w:r>
           </w:p>
         </w:tc>
@@ -11222,14 +11505,13 @@
           </w:tcPr>
           <w:p>
             <w:pPr>
-              <w:spacing w:after="0"/>
-              <w:jc w:val="both"/>
-            </w:pPr>
-            <w:r>
-              <w:rPr>
-                <w:sz w:val="19"/>
-              </w:rPr>
-              <w:t>api.js.</w:t>
+              <w:spacing w:after="40"/>
+            </w:pPr>
+            <w:r>
+              <w:rPr>
+                <w:sz w:val="18"/>
+              </w:rPr>
+              <w:t>AuthContext, api.js, siteData, global.css y format.js.</w:t>
             </w:r>
           </w:p>
         </w:tc>
@@ -11246,14 +11528,13 @@
           </w:tcPr>
           <w:p>
             <w:pPr>
-              <w:spacing w:after="0"/>
-              <w:jc w:val="both"/>
-            </w:pPr>
-            <w:r>
-              <w:rPr>
-                <w:sz w:val="19"/>
-              </w:rPr>
-              <w:t>Acceso HTTP centralizado.</w:t>
+              <w:spacing w:after="40"/>
+            </w:pPr>
+            <w:r>
+              <w:rPr>
+                <w:sz w:val="18"/>
+              </w:rPr>
+              <w:t>Estado de sesión, fachada HTTP, datos de presentación, estilo y formato común.</w:t>
             </w:r>
           </w:p>
         </w:tc>
@@ -11276,12 +11557,11 @@
           </w:tcPr>
           <w:p>
             <w:pPr>
-              <w:spacing w:after="0"/>
-              <w:jc w:val="both"/>
-            </w:pPr>
-            <w:r>
-              <w:rPr>
-                <w:sz w:val="19"/>
+              <w:spacing w:after="40"/>
+            </w:pPr>
+            <w:r>
+              <w:rPr>
+                <w:sz w:val="18"/>
               </w:rPr>
               <w:t>backend/src/controllers</w:t>
             </w:r>
@@ -11301,14 +11581,13 @@
           </w:tcPr>
           <w:p>
             <w:pPr>
-              <w:spacing w:after="0"/>
-              <w:jc w:val="both"/>
-            </w:pPr>
-            <w:r>
-              <w:rPr>
-                <w:sz w:val="19"/>
-              </w:rPr>
-              <w:t>authController, chatController, appointmentController, serviceController.</w:t>
+              <w:spacing w:after="40"/>
+            </w:pPr>
+            <w:r>
+              <w:rPr>
+                <w:sz w:val="18"/>
+              </w:rPr>
+              <w:t>authController, chatController, appointmentController, serviceController y healthController.</w:t>
             </w:r>
           </w:p>
         </w:tc>
@@ -11326,14 +11605,13 @@
           </w:tcPr>
           <w:p>
             <w:pPr>
-              <w:spacing w:after="0"/>
-              <w:jc w:val="both"/>
-            </w:pPr>
-            <w:r>
-              <w:rPr>
-                <w:sz w:val="19"/>
-              </w:rPr>
-              <w:t>Entrada de casos de uso.</w:t>
+              <w:spacing w:after="40"/>
+            </w:pPr>
+            <w:r>
+              <w:rPr>
+                <w:sz w:val="18"/>
+              </w:rPr>
+              <w:t>Entrada de casos de uso y composición de respuestas HTTP.</w:t>
             </w:r>
           </w:p>
         </w:tc>
@@ -11355,12 +11633,11 @@
           </w:tcPr>
           <w:p>
             <w:pPr>
-              <w:spacing w:after="0"/>
-              <w:jc w:val="both"/>
-            </w:pPr>
-            <w:r>
-              <w:rPr>
-                <w:sz w:val="19"/>
+              <w:spacing w:after="40"/>
+            </w:pPr>
+            <w:r>
+              <w:rPr>
+                <w:sz w:val="18"/>
               </w:rPr>
               <w:t>backend/src/services</w:t>
             </w:r>
@@ -11379,14 +11656,13 @@
           </w:tcPr>
           <w:p>
             <w:pPr>
-              <w:spacing w:after="0"/>
-              <w:jc w:val="both"/>
-            </w:pPr>
-            <w:r>
-              <w:rPr>
-                <w:sz w:val="19"/>
-              </w:rPr>
-              <w:t>appointmentService, bookingFlowService, lmStudioService, promptService.</w:t>
+              <w:spacing w:after="40"/>
+            </w:pPr>
+            <w:r>
+              <w:rPr>
+                <w:sz w:val="18"/>
+              </w:rPr>
+              <w:t>adminService, appointmentService, bookingFlowService, calendarService, chatRuleService, lmStudioService, promptService, responseParserService y serviceCatalogService.</w:t>
             </w:r>
           </w:p>
         </w:tc>
@@ -11403,14 +11679,13 @@
           </w:tcPr>
           <w:p>
             <w:pPr>
-              <w:spacing w:after="0"/>
-              <w:jc w:val="both"/>
-            </w:pPr>
-            <w:r>
-              <w:rPr>
-                <w:sz w:val="19"/>
-              </w:rPr>
-              <w:t>Reglas e integración aisladas.</w:t>
+              <w:spacing w:after="40"/>
+            </w:pPr>
+            <w:r>
+              <w:rPr>
+                <w:sz w:val="18"/>
+              </w:rPr>
+              <w:t>Reglas de negocio, integración de IA local, seguridad y sincronización de catálogo.</w:t>
             </w:r>
           </w:p>
         </w:tc>
@@ -11433,12 +11708,11 @@
           </w:tcPr>
           <w:p>
             <w:pPr>
-              <w:spacing w:after="0"/>
-              <w:jc w:val="both"/>
-            </w:pPr>
-            <w:r>
-              <w:rPr>
-                <w:sz w:val="19"/>
+              <w:spacing w:after="40"/>
+            </w:pPr>
+            <w:r>
+              <w:rPr>
+                <w:sz w:val="18"/>
               </w:rPr>
               <w:t>backend/src/models</w:t>
             </w:r>
@@ -11458,14 +11732,13 @@
           </w:tcPr>
           <w:p>
             <w:pPr>
-              <w:spacing w:after="0"/>
-              <w:jc w:val="both"/>
-            </w:pPr>
-            <w:r>
-              <w:rPr>
-                <w:sz w:val="19"/>
-              </w:rPr>
-              <w:t>Admin, Appointment.</w:t>
+              <w:spacing w:after="40"/>
+            </w:pPr>
+            <w:r>
+              <w:rPr>
+                <w:sz w:val="18"/>
+              </w:rPr>
+              <w:t>Admin, Appointment y Service.</w:t>
             </w:r>
           </w:p>
         </w:tc>
@@ -11483,24 +11756,283 @@
           </w:tcPr>
           <w:p>
             <w:pPr>
-              <w:spacing w:after="0"/>
-              <w:jc w:val="both"/>
-            </w:pPr>
-            <w:r>
-              <w:rPr>
-                <w:sz w:val="19"/>
+              <w:spacing w:after="40"/>
+            </w:pPr>
+            <w:r>
+              <w:rPr>
+                <w:sz w:val="18"/>
               </w:rPr>
               <w:t>Esquemas persistentes de MongoDB.</w:t>
+            </w:r>
+          </w:p>
+        </w:tc>
+      </w:tr>
+      <w:tr>
+        <w:trPr>
+          <w:jc w:val="center"/>
+        </w:trPr>
+        <w:tc>
+          <w:tcPr>
+            <w:tcW w:w="2449" w:type="dxa"/>
+          </w:tcPr>
+          <w:p>
+            <w:pPr>
+              <w:spacing w:after="40"/>
+            </w:pPr>
+            <w:r>
+              <w:rPr>
+                <w:sz w:val="18"/>
+              </w:rPr>
+              <w:t>backend/src/routes</w:t>
+            </w:r>
+          </w:p>
+        </w:tc>
+        <w:tc>
+          <w:tcPr>
+            <w:tcW w:w="4031" w:type="dxa"/>
+          </w:tcPr>
+          <w:p>
+            <w:pPr>
+              <w:spacing w:after="40"/>
+            </w:pPr>
+            <w:r>
+              <w:rPr>
+                <w:sz w:val="18"/>
+              </w:rPr>
+              <w:t>authRoutes, chatRoutes, appointmentRoutes, serviceRoutes y healthRoutes.</w:t>
+            </w:r>
+          </w:p>
+        </w:tc>
+        <w:tc>
+          <w:tcPr>
+            <w:tcW w:w="3384" w:type="dxa"/>
+          </w:tcPr>
+          <w:p>
+            <w:pPr>
+              <w:spacing w:after="40"/>
+            </w:pPr>
+            <w:r>
+              <w:rPr>
+                <w:sz w:val="18"/>
+              </w:rPr>
+              <w:t>Enrutado REST separado de controladores y reglas de negocio.</w:t>
+            </w:r>
+          </w:p>
+        </w:tc>
+      </w:tr>
+      <w:tr>
+        <w:trPr>
+          <w:jc w:val="center"/>
+        </w:trPr>
+        <w:tc>
+          <w:tcPr>
+            <w:tcW w:w="2449" w:type="dxa"/>
+          </w:tcPr>
+          <w:p>
+            <w:pPr>
+              <w:spacing w:after="40"/>
+            </w:pPr>
+            <w:r>
+              <w:rPr>
+                <w:sz w:val="18"/>
+              </w:rPr>
+              <w:t>backend/src/middleware y utils</w:t>
+            </w:r>
+          </w:p>
+        </w:tc>
+        <w:tc>
+          <w:tcPr>
+            <w:tcW w:w="4031" w:type="dxa"/>
+          </w:tcPr>
+          <w:p>
+            <w:pPr>
+              <w:spacing w:after="40"/>
+            </w:pPr>
+            <w:r>
+              <w:rPr>
+                <w:sz w:val="18"/>
+              </w:rPr>
+              <w:t>requireAuth, errorMiddleware, asyncHandler y AppError.</w:t>
+            </w:r>
+          </w:p>
+        </w:tc>
+        <w:tc>
+          <w:tcPr>
+            <w:tcW w:w="3384" w:type="dxa"/>
+          </w:tcPr>
+          <w:p>
+            <w:pPr>
+              <w:spacing w:after="40"/>
+            </w:pPr>
+            <w:r>
+              <w:rPr>
+                <w:sz w:val="18"/>
+              </w:rPr>
+              <w:t>Seguridad, manejo de errores y utilidades transversales reutilizables.</w:t>
+            </w:r>
+          </w:p>
+        </w:tc>
+      </w:tr>
+      <w:tr>
+        <w:trPr>
+          <w:jc w:val="center"/>
+        </w:trPr>
+        <w:tc>
+          <w:tcPr>
+            <w:tcW w:w="2449" w:type="dxa"/>
+          </w:tcPr>
+          <w:p>
+            <w:pPr>
+              <w:spacing w:after="40"/>
+            </w:pPr>
+            <w:r>
+              <w:rPr>
+                <w:sz w:val="18"/>
+              </w:rPr>
+              <w:t>backend/src/config y seed</w:t>
+            </w:r>
+          </w:p>
+        </w:tc>
+        <w:tc>
+          <w:tcPr>
+            <w:tcW w:w="4031" w:type="dxa"/>
+          </w:tcPr>
+          <w:p>
+            <w:pPr>
+              <w:spacing w:after="40"/>
+            </w:pPr>
+            <w:r>
+              <w:rPr>
+                <w:sz w:val="18"/>
+              </w:rPr>
+              <w:t>env, database, serviceCatalog y adminSeed.</w:t>
+            </w:r>
+          </w:p>
+        </w:tc>
+        <w:tc>
+          <w:tcPr>
+            <w:tcW w:w="3384" w:type="dxa"/>
+          </w:tcPr>
+          <w:p>
+            <w:pPr>
+              <w:spacing w:after="40"/>
+            </w:pPr>
+            <w:r>
+              <w:rPr>
+                <w:sz w:val="18"/>
+              </w:rPr>
+              <w:t>Configuración de entorno, conexión MongoDB, catálogo oficial e inicialización controlada.</w:t>
+            </w:r>
+          </w:p>
+        </w:tc>
+      </w:tr>
+      <w:tr>
+        <w:trPr>
+          <w:jc w:val="center"/>
+        </w:trPr>
+        <w:tc>
+          <w:tcPr>
+            <w:tcW w:w="2564" w:type="dxa"/>
+          </w:tcPr>
+          <w:p>
+            <w:pPr>
+              <w:spacing w:after="40"/>
+            </w:pPr>
+            <w:r>
+              <w:rPr>
+                <w:sz w:val="18"/>
+              </w:rPr>
+              <w:t>backend/tests</w:t>
+            </w:r>
+          </w:p>
+        </w:tc>
+        <w:tc>
+          <w:tcPr>
+            <w:tcW w:w="3973" w:type="dxa"/>
+          </w:tcPr>
+          <w:p>
+            <w:pPr>
+              <w:spacing w:after="40"/>
+            </w:pPr>
+            <w:r>
+              <w:rPr>
+                <w:sz w:val="18"/>
+              </w:rPr>
+              <w:t>calendarService.test.js, bookingFlowService.test.js y appointmentService.test.js.</w:t>
+            </w:r>
+          </w:p>
+        </w:tc>
+        <w:tc>
+          <w:tcPr>
+            <w:tcW w:w="3327" w:type="dxa"/>
+          </w:tcPr>
+          <w:p>
+            <w:pPr>
+              <w:spacing w:after="40"/>
+            </w:pPr>
+            <w:r>
+              <w:rPr>
+                <w:sz w:val="18"/>
+              </w:rPr>
+              <w:t>Verificación automática de reglas críticas.</w:t>
+            </w:r>
+          </w:p>
+        </w:tc>
+      </w:tr>
+      <w:tr>
+        <w:trPr>
+          <w:jc w:val="center"/>
+        </w:trPr>
+        <w:tc>
+          <w:tcPr>
+            <w:tcW w:w="2564" w:type="dxa"/>
+          </w:tcPr>
+          <w:p>
+            <w:pPr>
+              <w:spacing w:after="40"/>
+            </w:pPr>
+            <w:r>
+              <w:rPr>
+                <w:sz w:val="18"/>
+              </w:rPr>
+              <w:t>diagramas, RUP y entregas</w:t>
+            </w:r>
+          </w:p>
+        </w:tc>
+        <w:tc>
+          <w:tcPr>
+            <w:tcW w:w="3973" w:type="dxa"/>
+          </w:tcPr>
+          <w:p>
+            <w:pPr>
+              <w:spacing w:after="40"/>
+            </w:pPr>
+            <w:r>
+              <w:rPr>
+                <w:sz w:val="18"/>
+              </w:rPr>
+              <w:t>Fuentes PlantUML, imágenes, capturas, trazabilidad y documentos finales.</w:t>
+            </w:r>
+          </w:p>
+        </w:tc>
+        <w:tc>
+          <w:tcPr>
+            <w:tcW w:w="3327" w:type="dxa"/>
+          </w:tcPr>
+          <w:p>
+            <w:pPr>
+              <w:spacing w:after="40"/>
+            </w:pPr>
+            <w:r>
+              <w:rPr>
+                <w:sz w:val="18"/>
+              </w:rPr>
+              <w:t>Evidencia metodológica y material entregable.</w:t>
             </w:r>
           </w:p>
         </w:tc>
       </w:tr>
     </w:tbl>
-    <w:p>
-      <w:pPr>
-        <w:jc w:val="both"/>
-      </w:pPr>
-    </w:p>
     <w:p>
       <w:pPr>
         <w:pStyle w:val="Ttulo2"/>
@@ -11677,61 +12209,23 @@
               <w:spacing w:after="0"/>
               <w:jc w:val="both"/>
             </w:pPr>
-            <w:proofErr w:type="spellStart"/>
             <w:r>
               <w:rPr>
                 <w:sz w:val="19"/>
               </w:rPr>
-              <w:t>Secciones</w:t>
-            </w:r>
-            <w:proofErr w:type="spellEnd"/>
+              <w:t xml:space="preserve">Secciones </w:t>
+            </w:r>
             <w:r>
               <w:rPr>
                 <w:sz w:val="19"/>
               </w:rPr>
-              <w:t xml:space="preserve"> </w:t>
-            </w:r>
-            <w:proofErr w:type="spellStart"/>
+              <w:t>Inicio</w:t>
+            </w:r>
             <w:r>
               <w:rPr>
                 <w:sz w:val="19"/>
               </w:rPr>
-              <w:t>Inicio</w:t>
-            </w:r>
-            <w:proofErr w:type="spellEnd"/>
-            <w:r>
-              <w:rPr>
-                <w:sz w:val="19"/>
-              </w:rPr>
-              <w:t xml:space="preserve">, </w:t>
-            </w:r>
-            <w:proofErr w:type="spellStart"/>
-            <w:r>
-              <w:rPr>
-                <w:sz w:val="19"/>
-              </w:rPr>
-              <w:t>Servicios</w:t>
-            </w:r>
-            <w:proofErr w:type="spellEnd"/>
-            <w:r>
-              <w:rPr>
-                <w:sz w:val="19"/>
-              </w:rPr>
-              <w:t xml:space="preserve">, Combos, </w:t>
-            </w:r>
-            <w:proofErr w:type="spellStart"/>
-            <w:r>
-              <w:rPr>
-                <w:sz w:val="19"/>
-              </w:rPr>
-              <w:t>Nosotros</w:t>
-            </w:r>
-            <w:proofErr w:type="spellEnd"/>
-            <w:r>
-              <w:rPr>
-                <w:sz w:val="19"/>
-              </w:rPr>
-              <w:t>, Opiniones y Contacto; CTA de reserva visible.</w:t>
+              <w:t>, Servicios, Combos, Nosotros, Opiniones y Contacto; CTA de reserva visible.</w:t>
             </w:r>
           </w:p>
         </w:tc>
@@ -11761,6 +12255,7 @@
               <w:rPr>
                 <w:sz w:val="19"/>
               </w:rPr>
+              <w:lastRenderedPageBreak/>
               <w:t>ChatWidget</w:t>
             </w:r>
           </w:p>
@@ -12138,15 +12633,7 @@
     </w:p>
     <w:p>
       <w:r>
-        <w:t xml:space="preserve">Una decisión importante de usabilidad es la selección numerada de servicios. El catálogo 1..7 se comparte entre web, prompt, backend y colección servicios; de esta manera el usuario puede contestar simplemente “6” y el sistema traduce la opción a “Corte y Tinte”. Esto reduce ambigüedad del LLM y </w:t>
-      </w:r>
-      <w:proofErr w:type="spellStart"/>
-      <w:r>
-        <w:t>cumple</w:t>
-      </w:r>
-      <w:proofErr w:type="spellEnd"/>
-      <w:r>
-        <w:t xml:space="preserve"> RS-09.</w:t>
+        <w:t>Una decisión importante de usabilidad es la selección numerada de servicios. El catálogo 1..7 se comparte entre web, prompt, backend y colección servicios; de esta manera el usuario puede contestar simplemente “6” y el sistema traduce la opción a “Corte y Tinte”. Esto reduce ambigüedad del LLM y cumple RS-09.</w:t>
       </w:r>
     </w:p>
     <w:p>
@@ -12157,7 +12644,6 @@
           <w:szCs w:val="28"/>
         </w:rPr>
       </w:pPr>
-      <w:proofErr w:type="spellStart"/>
       <w:r>
         <w:rPr>
           <w:b/>
@@ -12166,7 +12652,6 @@
         </w:rPr>
         <w:t>HomePage</w:t>
       </w:r>
-      <w:proofErr w:type="spellEnd"/>
     </w:p>
     <w:p>
       <w:pPr>
@@ -12175,28 +12660,12 @@
           <w:szCs w:val="28"/>
         </w:rPr>
       </w:pPr>
-      <w:proofErr w:type="spellStart"/>
       <w:r>
         <w:rPr>
           <w:szCs w:val="28"/>
         </w:rPr>
-        <w:t>Secciones</w:t>
+        <w:t>Secciones Inicio</w:t>
       </w:r>
-      <w:proofErr w:type="spellEnd"/>
-      <w:r>
-        <w:rPr>
-          <w:szCs w:val="28"/>
-        </w:rPr>
-        <w:t xml:space="preserve"> </w:t>
-      </w:r>
-      <w:proofErr w:type="spellStart"/>
-      <w:r>
-        <w:rPr>
-          <w:szCs w:val="28"/>
-        </w:rPr>
-        <w:t>Inicio</w:t>
-      </w:r>
-      <w:proofErr w:type="spellEnd"/>
     </w:p>
     <w:p>
       <w:pPr>
@@ -12208,12 +12677,12 @@
       </w:pPr>
       <w:r>
         <w:rPr>
+          <w:noProof/>
           <w:sz w:val="20"/>
           <w:szCs w:val="24"/>
         </w:rPr>
-        <w:lastRenderedPageBreak/>
         <w:drawing>
-          <wp:inline distT="0" distB="0" distL="0" distR="0" wp14:anchorId="3E61C6B4" wp14:editId="5A5D78B6">
+          <wp:inline distT="0" distB="0" distL="0" distR="0" wp14:anchorId="254390A4" wp14:editId="2C10AA50">
             <wp:extent cx="6400800" cy="2972435"/>
             <wp:effectExtent l="0" t="0" r="0" b="0"/>
             <wp:docPr id="14" name="Imagen 14"/>
@@ -12262,11 +12731,9 @@
       <w:pPr>
         <w:spacing w:after="0"/>
       </w:pPr>
-      <w:proofErr w:type="spellStart"/>
       <w:r>
         <w:t>Servicios</w:t>
       </w:r>
-      <w:proofErr w:type="spellEnd"/>
     </w:p>
     <w:p>
       <w:pPr>
@@ -12278,8 +12745,12 @@
         <w:spacing w:after="0"/>
       </w:pPr>
       <w:r>
+        <w:rPr>
+          <w:noProof/>
+        </w:rPr>
+        <w:lastRenderedPageBreak/>
         <w:drawing>
-          <wp:inline distT="0" distB="0" distL="0" distR="0" wp14:anchorId="508948E4" wp14:editId="66C9E1F1">
+          <wp:inline distT="0" distB="0" distL="0" distR="0" wp14:anchorId="16628486" wp14:editId="5C82CAC4">
             <wp:extent cx="6400800" cy="2968625"/>
             <wp:effectExtent l="0" t="0" r="0" b="3175"/>
             <wp:docPr id="15" name="Imagen 15"/>
@@ -12338,9 +12809,11 @@
         <w:spacing w:after="0"/>
       </w:pPr>
       <w:r>
-        <w:lastRenderedPageBreak/>
+        <w:rPr>
+          <w:noProof/>
+        </w:rPr>
         <w:drawing>
-          <wp:inline distT="0" distB="0" distL="0" distR="0" wp14:anchorId="30052CD6" wp14:editId="7E1793BD">
+          <wp:inline distT="0" distB="0" distL="0" distR="0" wp14:anchorId="20A9A2FD" wp14:editId="26DE78F6">
             <wp:extent cx="6400800" cy="2555875"/>
             <wp:effectExtent l="0" t="0" r="0" b="0"/>
             <wp:docPr id="16" name="Imagen 16"/>
@@ -12385,11 +12858,9 @@
       <w:pPr>
         <w:spacing w:after="0"/>
       </w:pPr>
-      <w:proofErr w:type="spellStart"/>
       <w:r>
         <w:t>Nosotros</w:t>
       </w:r>
-      <w:proofErr w:type="spellEnd"/>
     </w:p>
     <w:p>
       <w:pPr>
@@ -12401,8 +12872,12 @@
         <w:spacing w:after="0"/>
       </w:pPr>
       <w:r>
+        <w:rPr>
+          <w:noProof/>
+        </w:rPr>
+        <w:lastRenderedPageBreak/>
         <w:drawing>
-          <wp:inline distT="0" distB="0" distL="0" distR="0" wp14:anchorId="658E4E1E" wp14:editId="62091CC6">
+          <wp:inline distT="0" distB="0" distL="0" distR="0" wp14:anchorId="3FD33FEC" wp14:editId="2648104F">
             <wp:extent cx="6400800" cy="2998470"/>
             <wp:effectExtent l="0" t="0" r="0" b="0"/>
             <wp:docPr id="17" name="Imagen 17"/>
@@ -12447,11 +12922,9 @@
       <w:pPr>
         <w:spacing w:after="0"/>
       </w:pPr>
-      <w:proofErr w:type="spellStart"/>
       <w:r>
         <w:t>Opiniones</w:t>
       </w:r>
-      <w:proofErr w:type="spellEnd"/>
     </w:p>
     <w:p>
       <w:pPr>
@@ -12463,9 +12936,11 @@
         <w:spacing w:after="0"/>
       </w:pPr>
       <w:r>
-        <w:lastRenderedPageBreak/>
+        <w:rPr>
+          <w:noProof/>
+        </w:rPr>
         <w:drawing>
-          <wp:inline distT="0" distB="0" distL="0" distR="0" wp14:anchorId="7F940EB1" wp14:editId="05E0A32F">
+          <wp:inline distT="0" distB="0" distL="0" distR="0" wp14:anchorId="35A67CCB" wp14:editId="4F0E4645">
             <wp:extent cx="6400800" cy="2972435"/>
             <wp:effectExtent l="0" t="0" r="0" b="0"/>
             <wp:docPr id="18" name="Imagen 18"/>
@@ -12510,11 +12985,9 @@
       <w:pPr>
         <w:spacing w:after="0"/>
       </w:pPr>
-      <w:proofErr w:type="spellStart"/>
       <w:r>
         <w:t>Contacto</w:t>
       </w:r>
-      <w:proofErr w:type="spellEnd"/>
     </w:p>
     <w:p>
       <w:pPr>
@@ -12526,8 +12999,11 @@
         <w:spacing w:after="0"/>
       </w:pPr>
       <w:r>
+        <w:rPr>
+          <w:noProof/>
+        </w:rPr>
         <w:drawing>
-          <wp:inline distT="0" distB="0" distL="0" distR="0" wp14:anchorId="0CF5F2C8" wp14:editId="48EAFFE8">
+          <wp:inline distT="0" distB="0" distL="0" distR="0" wp14:anchorId="71AAACB1" wp14:editId="3BAFE428">
             <wp:extent cx="6400800" cy="1270000"/>
             <wp:effectExtent l="0" t="0" r="0" b="6350"/>
             <wp:docPr id="19" name="Imagen 19"/>
@@ -12573,15 +13049,8 @@
         <w:spacing w:after="0"/>
       </w:pPr>
       <w:r>
-        <w:t xml:space="preserve">CTA de </w:t>
-      </w:r>
-      <w:proofErr w:type="spellStart"/>
-      <w:r>
-        <w:t>reserva</w:t>
-      </w:r>
-      <w:proofErr w:type="spellEnd"/>
-      <w:r>
-        <w:t xml:space="preserve"> visible</w:t>
+        <w:lastRenderedPageBreak/>
+        <w:t>CTA de reserva visible</w:t>
       </w:r>
     </w:p>
     <w:p>
@@ -12591,8 +13060,11 @@
     </w:p>
     <w:p>
       <w:r>
+        <w:rPr>
+          <w:noProof/>
+        </w:rPr>
         <w:drawing>
-          <wp:inline distT="0" distB="0" distL="0" distR="0" wp14:anchorId="7551E4F4" wp14:editId="6F1AE602">
+          <wp:inline distT="0" distB="0" distL="0" distR="0" wp14:anchorId="65D0B50F" wp14:editId="12BEFB2F">
             <wp:extent cx="6400800" cy="285115"/>
             <wp:effectExtent l="0" t="0" r="0" b="635"/>
             <wp:docPr id="21" name="Imagen 21"/>
@@ -12636,7 +13108,6 @@
           <w:bCs/>
         </w:rPr>
       </w:pPr>
-      <w:proofErr w:type="spellStart"/>
       <w:r>
         <w:rPr>
           <w:b/>
@@ -12644,29 +13115,25 @@
         </w:rPr>
         <w:t>ChatWidget</w:t>
       </w:r>
-      <w:proofErr w:type="spellEnd"/>
     </w:p>
     <w:p>
       <w:pPr>
         <w:spacing w:after="0"/>
       </w:pPr>
       <w:r>
-        <w:t xml:space="preserve">Ventana </w:t>
+        <w:t>Ventana flotante</w:t>
       </w:r>
-      <w:proofErr w:type="spellStart"/>
-      <w:r>
-        <w:t>flotante</w:t>
-      </w:r>
-      <w:proofErr w:type="spellEnd"/>
     </w:p>
     <w:p>
       <w:pPr>
         <w:spacing w:after="0"/>
       </w:pPr>
       <w:r>
-        <w:lastRenderedPageBreak/>
+        <w:rPr>
+          <w:noProof/>
+        </w:rPr>
         <w:drawing>
-          <wp:inline distT="0" distB="0" distL="0" distR="0" wp14:anchorId="58F4970C" wp14:editId="591A865E">
+          <wp:inline distT="0" distB="0" distL="0" distR="0" wp14:anchorId="43B701C8" wp14:editId="5ECC28FA">
             <wp:extent cx="3279353" cy="2946400"/>
             <wp:effectExtent l="0" t="0" r="0" b="6350"/>
             <wp:docPr id="22" name="Imagen 22"/>
@@ -12711,22 +13178,23 @@
       <w:pPr>
         <w:spacing w:after="0"/>
       </w:pPr>
-      <w:proofErr w:type="spellStart"/>
       <w:r>
         <w:t>A</w:t>
       </w:r>
       <w:r>
         <w:t>utoscroll</w:t>
       </w:r>
-      <w:proofErr w:type="spellEnd"/>
     </w:p>
     <w:p>
       <w:pPr>
         <w:spacing w:after="0"/>
       </w:pPr>
       <w:r>
+        <w:rPr>
+          <w:noProof/>
+        </w:rPr>
         <w:drawing>
-          <wp:inline distT="0" distB="0" distL="0" distR="0" wp14:anchorId="69B8C32E" wp14:editId="37B160AD">
+          <wp:inline distT="0" distB="0" distL="0" distR="0" wp14:anchorId="594CD80F" wp14:editId="74099E19">
             <wp:extent cx="2787650" cy="3523716"/>
             <wp:effectExtent l="0" t="0" r="0" b="635"/>
             <wp:docPr id="23" name="Imagen 23"/>
@@ -12766,14 +13234,12 @@
       <w:pPr>
         <w:spacing w:after="0"/>
       </w:pPr>
-      <w:proofErr w:type="spellStart"/>
       <w:r>
         <w:t>H</w:t>
       </w:r>
       <w:r>
         <w:t>istorial</w:t>
       </w:r>
-      <w:proofErr w:type="spellEnd"/>
     </w:p>
     <w:p>
       <w:pPr>
@@ -12785,9 +13251,12 @@
         <w:spacing w:after="0"/>
       </w:pPr>
       <w:r>
+        <w:rPr>
+          <w:noProof/>
+        </w:rPr>
         <w:lastRenderedPageBreak/>
         <w:drawing>
-          <wp:inline distT="0" distB="0" distL="0" distR="0" wp14:anchorId="646C9C1D" wp14:editId="1BFEF6F7">
+          <wp:inline distT="0" distB="0" distL="0" distR="0" wp14:anchorId="30031F71" wp14:editId="02D9FD5C">
             <wp:extent cx="2990850" cy="3578624"/>
             <wp:effectExtent l="0" t="0" r="0" b="3175"/>
             <wp:docPr id="24" name="Imagen 24"/>
@@ -12832,22 +13301,12 @@
       <w:pPr>
         <w:spacing w:after="0"/>
       </w:pPr>
-      <w:proofErr w:type="spellStart"/>
       <w:r>
         <w:t>A</w:t>
       </w:r>
       <w:r>
-        <w:t>cciones</w:t>
+        <w:t>cciones rápidas</w:t>
       </w:r>
-      <w:proofErr w:type="spellEnd"/>
-      <w:r>
-        <w:t xml:space="preserve"> </w:t>
-      </w:r>
-      <w:proofErr w:type="spellStart"/>
-      <w:r>
-        <w:t>rápidas</w:t>
-      </w:r>
-      <w:proofErr w:type="spellEnd"/>
     </w:p>
     <w:p>
       <w:pPr>
@@ -12859,8 +13318,11 @@
         <w:spacing w:after="0"/>
       </w:pPr>
       <w:r>
+        <w:rPr>
+          <w:noProof/>
+        </w:rPr>
         <w:drawing>
-          <wp:inline distT="0" distB="0" distL="0" distR="0" wp14:anchorId="21424D10" wp14:editId="2CF2FDC6">
+          <wp:inline distT="0" distB="0" distL="0" distR="0" wp14:anchorId="7FD95496" wp14:editId="4F8EF81A">
             <wp:extent cx="2832100" cy="3678853"/>
             <wp:effectExtent l="0" t="0" r="6350" b="0"/>
             <wp:docPr id="25" name="Imagen 25"/>
@@ -12909,29 +13371,8 @@
         <w:t>E</w:t>
       </w:r>
       <w:r>
-        <w:t xml:space="preserve">ntrada </w:t>
+        <w:t>ntrada única y tarjeta de confirmación</w:t>
       </w:r>
-      <w:proofErr w:type="spellStart"/>
-      <w:r>
-        <w:t>única</w:t>
-      </w:r>
-      <w:proofErr w:type="spellEnd"/>
-      <w:r>
-        <w:t xml:space="preserve"> y </w:t>
-      </w:r>
-      <w:proofErr w:type="spellStart"/>
-      <w:r>
-        <w:t>tarjeta</w:t>
-      </w:r>
-      <w:proofErr w:type="spellEnd"/>
-      <w:r>
-        <w:t xml:space="preserve"> de </w:t>
-      </w:r>
-      <w:proofErr w:type="spellStart"/>
-      <w:r>
-        <w:t>confirmación</w:t>
-      </w:r>
-      <w:proofErr w:type="spellEnd"/>
     </w:p>
     <w:p>
       <w:pPr>
@@ -12943,9 +13384,12 @@
         <w:spacing w:after="0"/>
       </w:pPr>
       <w:r>
+        <w:rPr>
+          <w:noProof/>
+        </w:rPr>
         <w:lastRenderedPageBreak/>
         <w:drawing>
-          <wp:inline distT="0" distB="0" distL="0" distR="0" wp14:anchorId="5AA1F998" wp14:editId="69E3A2C3">
+          <wp:inline distT="0" distB="0" distL="0" distR="0" wp14:anchorId="3AD0E6B8" wp14:editId="7B30028C">
             <wp:extent cx="2794000" cy="3594596"/>
             <wp:effectExtent l="0" t="0" r="6350" b="6350"/>
             <wp:docPr id="26" name="Imagen 26"/>
@@ -12989,7 +13433,6 @@
           <w:bCs/>
         </w:rPr>
       </w:pPr>
-      <w:proofErr w:type="spellStart"/>
       <w:r>
         <w:rPr>
           <w:b/>
@@ -12997,25 +13440,14 @@
         </w:rPr>
         <w:t>AdminLogin</w:t>
       </w:r>
-      <w:proofErr w:type="spellEnd"/>
     </w:p>
     <w:p>
       <w:pPr>
         <w:spacing w:after="0"/>
       </w:pPr>
-      <w:proofErr w:type="spellStart"/>
       <w:r>
-        <w:t>Formulario</w:t>
+        <w:t>Formulario centrado</w:t>
       </w:r>
-      <w:proofErr w:type="spellEnd"/>
-      <w:r>
-        <w:t xml:space="preserve"> </w:t>
-      </w:r>
-      <w:proofErr w:type="spellStart"/>
-      <w:r>
-        <w:t>centrado</w:t>
-      </w:r>
-      <w:proofErr w:type="spellEnd"/>
     </w:p>
     <w:p>
       <w:pPr>
@@ -13027,8 +13459,11 @@
         <w:spacing w:after="0"/>
       </w:pPr>
       <w:r>
+        <w:rPr>
+          <w:noProof/>
+        </w:rPr>
         <w:drawing>
-          <wp:inline distT="0" distB="0" distL="0" distR="0" wp14:anchorId="0888F854" wp14:editId="37F4B858">
+          <wp:inline distT="0" distB="0" distL="0" distR="0" wp14:anchorId="7BDEAFAA" wp14:editId="290601DF">
             <wp:extent cx="6400800" cy="2922270"/>
             <wp:effectExtent l="0" t="0" r="0" b="0"/>
             <wp:docPr id="27" name="Imagen 27"/>
@@ -13073,32 +13508,22 @@
       <w:pPr>
         <w:spacing w:after="0"/>
       </w:pPr>
-      <w:proofErr w:type="spellStart"/>
       <w:r>
         <w:t>V</w:t>
       </w:r>
       <w:r>
-        <w:t>alidación</w:t>
-      </w:r>
-      <w:proofErr w:type="spellEnd"/>
-      <w:r>
-        <w:t xml:space="preserve"> y </w:t>
-      </w:r>
-      <w:proofErr w:type="spellStart"/>
-      <w:r>
-        <w:t>transición</w:t>
-      </w:r>
-      <w:proofErr w:type="spellEnd"/>
-      <w:r>
-        <w:t xml:space="preserve"> al panel con token JWT</w:t>
+        <w:t>alidación y transición al panel con token JWT</w:t>
       </w:r>
     </w:p>
     <w:p/>
     <w:p>
       <w:r>
+        <w:rPr>
+          <w:noProof/>
+        </w:rPr>
         <w:lastRenderedPageBreak/>
         <w:drawing>
-          <wp:inline distT="0" distB="0" distL="0" distR="0" wp14:anchorId="1663293D" wp14:editId="697DA6C3">
+          <wp:inline distT="0" distB="0" distL="0" distR="0" wp14:anchorId="66829E41" wp14:editId="3BFE0013">
             <wp:extent cx="6400800" cy="2943860"/>
             <wp:effectExtent l="0" t="0" r="0" b="8890"/>
             <wp:docPr id="28" name="Imagen 28"/>
@@ -13142,7 +13567,6 @@
           <w:bCs/>
         </w:rPr>
       </w:pPr>
-      <w:proofErr w:type="spellStart"/>
       <w:r>
         <w:rPr>
           <w:b/>
@@ -13150,7 +13574,6 @@
         </w:rPr>
         <w:t>AdminDashboard</w:t>
       </w:r>
-      <w:proofErr w:type="spellEnd"/>
     </w:p>
     <w:p>
       <w:pPr>
@@ -13160,24 +13583,11 @@
         <w:t>KPIs</w:t>
       </w:r>
       <w:r>
-        <w:t xml:space="preserve"> e </w:t>
-      </w:r>
-      <w:proofErr w:type="spellStart"/>
-      <w:r>
-        <w:t>I</w:t>
+        <w:t xml:space="preserve"> e I</w:t>
       </w:r>
       <w:r>
-        <w:t>ngresos</w:t>
+        <w:t>ngresos estimados</w:t>
       </w:r>
-      <w:proofErr w:type="spellEnd"/>
-      <w:r>
-        <w:t xml:space="preserve"> </w:t>
-      </w:r>
-      <w:proofErr w:type="spellStart"/>
-      <w:r>
-        <w:t>estimados</w:t>
-      </w:r>
-      <w:proofErr w:type="spellEnd"/>
     </w:p>
     <w:p>
       <w:pPr>
@@ -13189,8 +13599,11 @@
         <w:spacing w:after="0"/>
       </w:pPr>
       <w:r>
+        <w:rPr>
+          <w:noProof/>
+        </w:rPr>
         <w:drawing>
-          <wp:inline distT="0" distB="0" distL="0" distR="0" wp14:anchorId="1A19BF3F" wp14:editId="51ED3437">
+          <wp:inline distT="0" distB="0" distL="0" distR="0" wp14:anchorId="1A55B84A" wp14:editId="658BAB20">
             <wp:extent cx="6400800" cy="1136650"/>
             <wp:effectExtent l="0" t="0" r="0" b="6350"/>
             <wp:docPr id="30" name="Imagen 30"/>
@@ -13235,38 +13648,12 @@
       <w:pPr>
         <w:spacing w:after="0"/>
       </w:pPr>
-      <w:proofErr w:type="spellStart"/>
       <w:r>
         <w:t>P</w:t>
       </w:r>
       <w:r>
-        <w:t>róximas</w:t>
+        <w:t>róximas citas para visión rápida</w:t>
       </w:r>
-      <w:proofErr w:type="spellEnd"/>
-      <w:r>
-        <w:t xml:space="preserve"> </w:t>
-      </w:r>
-      <w:proofErr w:type="spellStart"/>
-      <w:r>
-        <w:t>citas</w:t>
-      </w:r>
-      <w:proofErr w:type="spellEnd"/>
-      <w:r>
-        <w:t xml:space="preserve"> para </w:t>
-      </w:r>
-      <w:proofErr w:type="spellStart"/>
-      <w:r>
-        <w:t>visión</w:t>
-      </w:r>
-      <w:proofErr w:type="spellEnd"/>
-      <w:r>
-        <w:t xml:space="preserve"> </w:t>
-      </w:r>
-      <w:proofErr w:type="spellStart"/>
-      <w:r>
-        <w:t>rápida</w:t>
-      </w:r>
-      <w:proofErr w:type="spellEnd"/>
     </w:p>
     <w:p>
       <w:pPr>
@@ -13278,8 +13665,11 @@
         <w:spacing w:after="0"/>
       </w:pPr>
       <w:r>
+        <w:rPr>
+          <w:noProof/>
+        </w:rPr>
         <w:drawing>
-          <wp:inline distT="0" distB="0" distL="0" distR="0" wp14:anchorId="2A645930" wp14:editId="107F5346">
+          <wp:inline distT="0" distB="0" distL="0" distR="0" wp14:anchorId="3A30C5F7" wp14:editId="7C275850">
             <wp:extent cx="6400800" cy="2944495"/>
             <wp:effectExtent l="0" t="0" r="0" b="8255"/>
             <wp:docPr id="31" name="Imagen 31"/>
@@ -13323,7 +13713,6 @@
           <w:bCs/>
         </w:rPr>
       </w:pPr>
-      <w:proofErr w:type="spellStart"/>
       <w:r>
         <w:rPr>
           <w:b/>
@@ -13331,49 +13720,14 @@
         </w:rPr>
         <w:t>AdminAppointments</w:t>
       </w:r>
-      <w:proofErr w:type="spellEnd"/>
     </w:p>
     <w:p>
       <w:pPr>
         <w:spacing w:after="0"/>
       </w:pPr>
-      <w:proofErr w:type="spellStart"/>
       <w:r>
-        <w:t>Filtros</w:t>
+        <w:t>Filtros por estado, fecha y orden</w:t>
       </w:r>
-      <w:proofErr w:type="spellEnd"/>
-      <w:r>
-        <w:t xml:space="preserve"> </w:t>
-      </w:r>
-      <w:proofErr w:type="spellStart"/>
-      <w:r>
-        <w:t>por</w:t>
-      </w:r>
-      <w:proofErr w:type="spellEnd"/>
-      <w:r>
-        <w:t xml:space="preserve"> </w:t>
-      </w:r>
-      <w:proofErr w:type="spellStart"/>
-      <w:r>
-        <w:t>estado</w:t>
-      </w:r>
-      <w:proofErr w:type="spellEnd"/>
-      <w:r>
-        <w:t xml:space="preserve">, </w:t>
-      </w:r>
-      <w:proofErr w:type="spellStart"/>
-      <w:r>
-        <w:t>fecha</w:t>
-      </w:r>
-      <w:proofErr w:type="spellEnd"/>
-      <w:r>
-        <w:t xml:space="preserve"> y </w:t>
-      </w:r>
-      <w:proofErr w:type="spellStart"/>
-      <w:r>
-        <w:t>orden</w:t>
-      </w:r>
-      <w:proofErr w:type="spellEnd"/>
     </w:p>
     <w:p>
       <w:pPr>
@@ -13385,8 +13739,11 @@
         <w:spacing w:after="0"/>
       </w:pPr>
       <w:r>
+        <w:rPr>
+          <w:noProof/>
+        </w:rPr>
         <w:drawing>
-          <wp:inline distT="0" distB="0" distL="0" distR="0" wp14:anchorId="58F45875" wp14:editId="4B792F35">
+          <wp:inline distT="0" distB="0" distL="0" distR="0" wp14:anchorId="0C73EF20" wp14:editId="56A94E0E">
             <wp:extent cx="6400800" cy="1433830"/>
             <wp:effectExtent l="0" t="0" r="0" b="0"/>
             <wp:docPr id="32" name="Imagen 32"/>
@@ -13431,44 +13788,21 @@
       <w:pPr>
         <w:spacing w:after="0"/>
       </w:pPr>
-      <w:proofErr w:type="spellStart"/>
       <w:r>
         <w:t>A</w:t>
       </w:r>
       <w:r>
-        <w:t>cciones</w:t>
+        <w:t>cciones editar, completar y eliminar</w:t>
       </w:r>
-      <w:proofErr w:type="spellEnd"/>
-      <w:r>
-        <w:t xml:space="preserve"> </w:t>
-      </w:r>
-      <w:proofErr w:type="spellStart"/>
-      <w:r>
-        <w:t>editar</w:t>
-      </w:r>
-      <w:proofErr w:type="spellEnd"/>
-      <w:r>
-        <w:t xml:space="preserve">, </w:t>
-      </w:r>
-      <w:proofErr w:type="spellStart"/>
-      <w:r>
-        <w:t>completar</w:t>
-      </w:r>
-      <w:proofErr w:type="spellEnd"/>
-      <w:r>
-        <w:t xml:space="preserve"> y </w:t>
-      </w:r>
-      <w:proofErr w:type="spellStart"/>
-      <w:r>
-        <w:t>eliminar</w:t>
-      </w:r>
-      <w:proofErr w:type="spellEnd"/>
     </w:p>
     <w:p/>
     <w:p>
       <w:r>
+        <w:rPr>
+          <w:noProof/>
+        </w:rPr>
         <w:drawing>
-          <wp:inline distT="0" distB="0" distL="0" distR="0" wp14:anchorId="0D53C7AA" wp14:editId="797F3808">
+          <wp:inline distT="0" distB="0" distL="0" distR="0" wp14:anchorId="3824481A" wp14:editId="62EEDF31">
             <wp:extent cx="6400800" cy="1547495"/>
             <wp:effectExtent l="0" t="0" r="0" b="0"/>
             <wp:docPr id="33" name="Imagen 33"/>
@@ -13513,7 +13847,6 @@
           <w:bCs/>
         </w:rPr>
       </w:pPr>
-      <w:proofErr w:type="spellStart"/>
       <w:r>
         <w:rPr>
           <w:b/>
@@ -13521,36 +13854,14 @@
         </w:rPr>
         <w:t>AdminCreateAppointment</w:t>
       </w:r>
-      <w:proofErr w:type="spellEnd"/>
     </w:p>
     <w:p>
       <w:pPr>
         <w:spacing w:after="0"/>
       </w:pPr>
       <w:r>
-        <w:t xml:space="preserve">Alta manual de </w:t>
+        <w:t>Alta manual de cita reutilizando AppointmentForm</w:t>
       </w:r>
-      <w:proofErr w:type="spellStart"/>
-      <w:r>
-        <w:t>cita</w:t>
-      </w:r>
-      <w:proofErr w:type="spellEnd"/>
-      <w:r>
-        <w:t xml:space="preserve"> </w:t>
-      </w:r>
-      <w:proofErr w:type="spellStart"/>
-      <w:r>
-        <w:t>reutilizando</w:t>
-      </w:r>
-      <w:proofErr w:type="spellEnd"/>
-      <w:r>
-        <w:t xml:space="preserve"> </w:t>
-      </w:r>
-      <w:proofErr w:type="spellStart"/>
-      <w:r>
-        <w:t>AppointmentForm</w:t>
-      </w:r>
-      <w:proofErr w:type="spellEnd"/>
     </w:p>
     <w:p>
       <w:pPr>
@@ -13562,8 +13873,11 @@
         <w:spacing w:after="0"/>
       </w:pPr>
       <w:r>
+        <w:rPr>
+          <w:noProof/>
+        </w:rPr>
         <w:drawing>
-          <wp:inline distT="0" distB="0" distL="0" distR="0" wp14:anchorId="73D56560" wp14:editId="0F5B68CF">
+          <wp:inline distT="0" distB="0" distL="0" distR="0" wp14:anchorId="00F53B2A" wp14:editId="5AEB5DFF">
             <wp:extent cx="6400800" cy="2976880"/>
             <wp:effectExtent l="0" t="0" r="0" b="0"/>
             <wp:docPr id="34" name="Imagen 34"/>
@@ -13606,23 +13920,7 @@
         <w:pStyle w:val="Ttulo2"/>
       </w:pPr>
       <w:r>
-        <w:t xml:space="preserve">3.2.6 </w:t>
-      </w:r>
-      <w:proofErr w:type="spellStart"/>
-      <w:r>
-        <w:t>Diseño</w:t>
-      </w:r>
-      <w:proofErr w:type="spellEnd"/>
-      <w:r>
-        <w:t xml:space="preserve"> de </w:t>
-      </w:r>
-      <w:proofErr w:type="spellStart"/>
-      <w:r>
-        <w:t>integración</w:t>
-      </w:r>
-      <w:proofErr w:type="spellEnd"/>
-      <w:r>
-        <w:t xml:space="preserve"> con sistemas locales</w:t>
+        <w:t>3.2.6 Diseño de integración con sistemas locales</w:t>
       </w:r>
     </w:p>
     <w:p>
@@ -13630,7 +13928,7 @@
         <w:jc w:val="both"/>
       </w:pPr>
       <w:r>
-        <w:t>La integración más sensible es el chatbot. El diseño no confía ciegamente en el texto generado por el modelo: primero se ejecutan reglas deterministas, después se usa LM Studio para conversación natural y finalmente se parsea y valida cualquier candidato de cita antes de guardarlo.</w:t>
+        <w:t>La integración más sensible es el chatbot. La Figura 3.13 refleja el orden real de chatController: primero intenta bookingFlowService; si no hay respuesta determinista, consulta chatRuleService; cuando necesita IA, construye mensajes con promptService, llama a lmStudioService, parsea con responseParserService y solo después delega en appointmentService. Así ningún texto generado se persiste sin validación de negocio.</w:t>
       </w:r>
     </w:p>
     <w:tbl>
@@ -14275,8 +14573,8 @@
           <w:noProof/>
         </w:rPr>
         <w:drawing>
-          <wp:inline distT="0" distB="0" distL="0" distR="0" wp14:anchorId="2E65A844" wp14:editId="0CF4F4E0">
-            <wp:extent cx="6172200" cy="4611868"/>
+          <wp:inline distT="0" distB="0" distL="0" distR="0" wp14:anchorId="1281F222" wp14:editId="1E32AFE9">
+            <wp:extent cx="6172200" cy="4276100"/>
             <wp:effectExtent l="0" t="0" r="0" b="0"/>
             <wp:docPr id="13" name="Picture 13"/>
             <wp:cNvGraphicFramePr>
@@ -14298,7 +14596,7 @@
                   <pic:spPr>
                     <a:xfrm>
                       <a:off x="0" y="0"/>
-                      <a:ext cx="6172200" cy="4611868"/>
+                      <a:ext cx="6172200" cy="4276100"/>
                     </a:xfrm>
                     <a:prstGeom prst="rect">
                       <a:avLst/>
@@ -14685,23 +14983,7 @@
                 <w:sz w:val="20"/>
                 <w:szCs w:val="24"/>
               </w:rPr>
-              <w:t xml:space="preserve">Publica las opciones </w:t>
-            </w:r>
-            <w:proofErr w:type="gramStart"/>
-            <w:r>
-              <w:rPr>
-                <w:sz w:val="20"/>
-                <w:szCs w:val="24"/>
-              </w:rPr>
-              <w:t>1..</w:t>
-            </w:r>
-            <w:proofErr w:type="gramEnd"/>
-            <w:r>
-              <w:rPr>
-                <w:sz w:val="20"/>
-                <w:szCs w:val="24"/>
-              </w:rPr>
-              <w:t>7 desde SERVICE_CATALOG para que cliente, prompt y backend compartan la misma fuente de verdad.</w:t>
+              <w:t>Publica las opciones 1..7 desde SERVICE_CATALOG para que cliente, prompt y backend compartan la misma fuente de verdad.</w:t>
             </w:r>
           </w:p>
         </w:tc>
@@ -15116,17 +15398,8 @@
                 <w:sz w:val="20"/>
                 <w:szCs w:val="24"/>
               </w:rPr>
-              <w:t xml:space="preserve">lmStudioService, </w:t>
-            </w:r>
-            <w:proofErr w:type="gramStart"/>
-            <w:r>
-              <w:rPr>
-                <w:sz w:val="20"/>
-                <w:szCs w:val="24"/>
-              </w:rPr>
-              <w:t>env.lmStudioTimeoutMs</w:t>
-            </w:r>
-            <w:proofErr w:type="gramEnd"/>
+              <w:t>lmStudioService, env.lmStudioTimeoutMs</w:t>
+            </w:r>
           </w:p>
         </w:tc>
         <w:tc>
@@ -15392,11 +15665,7 @@
               </w:rPr>
             </w:pPr>
             <w:r>
-              <w:rPr>
-                <w:sz w:val="20"/>
-                <w:szCs w:val="24"/>
-              </w:rPr>
-              <w:t>authController, Admin, bcrypt</w:t>
+              <w:t>adminService, Admin, bcrypt</w:t>
             </w:r>
           </w:p>
         </w:tc>
@@ -15786,23 +16055,7 @@
                 <w:sz w:val="20"/>
                 <w:szCs w:val="24"/>
               </w:rPr>
-              <w:t xml:space="preserve">Opciones </w:t>
-            </w:r>
-            <w:proofErr w:type="gramStart"/>
-            <w:r>
-              <w:rPr>
-                <w:sz w:val="20"/>
-                <w:szCs w:val="24"/>
-              </w:rPr>
-              <w:t>1..</w:t>
-            </w:r>
-            <w:proofErr w:type="gramEnd"/>
-            <w:r>
-              <w:rPr>
-                <w:sz w:val="20"/>
-                <w:szCs w:val="24"/>
-              </w:rPr>
-              <w:t>7 coherentes en prompt, API y DB.</w:t>
+              <w:t>Opciones 1..7 coherentes en prompt, API y DB.</w:t>
             </w:r>
           </w:p>
         </w:tc>
@@ -15853,19 +16106,8 @@
             <w:vAlign w:val="center"/>
           </w:tcPr>
           <w:p>
-            <w:pPr>
-              <w:spacing w:after="0"/>
-              <w:rPr>
-                <w:sz w:val="20"/>
-                <w:szCs w:val="24"/>
-              </w:rPr>
-            </w:pPr>
-            <w:r>
-              <w:rPr>
-                <w:sz w:val="20"/>
-                <w:szCs w:val="24"/>
-              </w:rPr>
-              <w:t>MongoDB, Appointment</w:t>
+            <w:r>
+              <w:t>MongoDB, Appointment, Admin, Service</w:t>
             </w:r>
           </w:p>
         </w:tc>
@@ -15882,19 +16124,8 @@
             <w:vAlign w:val="center"/>
           </w:tcPr>
           <w:p>
-            <w:pPr>
-              <w:spacing w:after="0"/>
-              <w:rPr>
-                <w:sz w:val="20"/>
-                <w:szCs w:val="24"/>
-              </w:rPr>
-            </w:pPr>
-            <w:r>
-              <w:rPr>
-                <w:sz w:val="20"/>
-                <w:szCs w:val="24"/>
-              </w:rPr>
-              <w:t>Citas guardadas con estado, origen e intervalo.</w:t>
+            <w:r>
+              <w:t>Citas, cuenta administrativa y catálogo público persistidos o sincronizados.</w:t>
             </w:r>
           </w:p>
         </w:tc>
@@ -16811,27 +17042,11 @@
         <w:pStyle w:val="Ttulo2"/>
       </w:pPr>
       <w:r>
-        <w:t>3.</w:t>
+        <w:t xml:space="preserve">3.4 </w:t>
       </w:r>
       <w:r>
-        <w:t>4</w:t>
+        <w:t>Auditoría diseño-implementación</w:t>
       </w:r>
-      <w:r>
-        <w:t xml:space="preserve"> </w:t>
-      </w:r>
-      <w:proofErr w:type="spellStart"/>
-      <w:r>
-        <w:t>Auditoría</w:t>
-      </w:r>
-      <w:proofErr w:type="spellEnd"/>
-      <w:r>
-        <w:t xml:space="preserve"> </w:t>
-      </w:r>
-      <w:proofErr w:type="spellStart"/>
-      <w:r>
-        <w:t>diseño-implementación</w:t>
-      </w:r>
-      <w:proofErr w:type="spellEnd"/>
     </w:p>
     <w:p>
       <w:pPr>
@@ -16840,33 +17055,11 @@
           <w:rFonts w:cs="Calibri"/>
         </w:rPr>
       </w:pPr>
-      <w:proofErr w:type="spellStart"/>
       <w:r>
         <w:rPr>
           <w:rFonts w:cs="Calibri"/>
         </w:rPr>
-        <w:t>Siguiendo</w:t>
-      </w:r>
-      <w:proofErr w:type="spellEnd"/>
-      <w:r>
-        <w:rPr>
-          <w:rFonts w:cs="Calibri"/>
-        </w:rPr>
-        <w:t xml:space="preserve"> la </w:t>
-      </w:r>
-      <w:proofErr w:type="spellStart"/>
-      <w:r>
-        <w:rPr>
-          <w:rFonts w:cs="Calibri"/>
-        </w:rPr>
-        <w:t>práctica</w:t>
-      </w:r>
-      <w:proofErr w:type="spellEnd"/>
-      <w:r>
-        <w:rPr>
-          <w:rFonts w:cs="Calibri"/>
-        </w:rPr>
-        <w:t xml:space="preserve"> de revisión de pySigHor, se contrasta el diseño con el código real. El objetivo es evitar brechas entre lo modelado en análisis y diseño y lo construido finalmente en React, Node.js, Express, MongoDB y LM Studio.</w:t>
+        <w:t>Siguiendo la práctica de revisión de pySigHor, se contrasta el diseño con el código real. El objetivo es evitar brechas entre lo modelado en análisis y diseño y lo construido finalmente en React, Node.js, Express, MongoDB y LM Studio.</w:t>
       </w:r>
     </w:p>
     <w:tbl>
@@ -17255,10 +17448,7 @@
               </w:rPr>
             </w:pPr>
             <w:r>
-              <w:rPr>
-                <w:rFonts w:cs="Calibri"/>
-              </w:rPr>
-              <w:t>authController, requireAuth y appointmentRoutes.</w:t>
+              <w:t>authController, adminService, requireAuth y appointmentRoutes.</w:t>
             </w:r>
           </w:p>
         </w:tc>
@@ -17434,6 +17624,48 @@
                 <w:rFonts w:cs="Calibri"/>
               </w:rPr>
               <w:t>Reforzado</w:t>
+            </w:r>
+          </w:p>
+        </w:tc>
+      </w:tr>
+      <w:tr>
+        <w:tc>
+          <w:tcPr>
+            <w:tcW w:w="1722" w:type="dxa"/>
+          </w:tcPr>
+          <w:p>
+            <w:r>
+              <w:t>Catálogo de servicios</w:t>
+            </w:r>
+          </w:p>
+        </w:tc>
+        <w:tc>
+          <w:tcPr>
+            <w:tcW w:w="3230" w:type="dxa"/>
+          </w:tcPr>
+          <w:p>
+            <w:r>
+              <w:t>Fuente única para web, chat y persistencia.</w:t>
+            </w:r>
+          </w:p>
+        </w:tc>
+        <w:tc>
+          <w:tcPr>
+            <w:tcW w:w="4215" w:type="dxa"/>
+          </w:tcPr>
+          <w:p>
+            <w:r>
+              <w:t>SERVICE_CATALOG, serviceCatalogService y Service.</w:t>
+            </w:r>
+          </w:p>
+        </w:tc>
+        <w:tc>
+          <w:tcPr>
+            <w:tcW w:w="1129" w:type="dxa"/>
+          </w:tcPr>
+          <w:p>
+            <w:r>
+              <w:t>Correcto</w:t>
             </w:r>
           </w:p>
         </w:tc>
@@ -17444,10 +17676,7 @@
         <w:pStyle w:val="Ttulo2"/>
       </w:pPr>
       <w:r>
-        <w:t>3.</w:t>
-      </w:r>
-      <w:r>
-        <w:t>5</w:t>
+        <w:t>3.5</w:t>
       </w:r>
       <w:r>
         <w:rPr>
@@ -17461,21 +17690,8 @@
         <w:t xml:space="preserve"> </w:t>
       </w:r>
       <w:r>
-        <w:t xml:space="preserve">Plan de </w:t>
+        <w:t>Plan de pruebas automatizadas</w:t>
       </w:r>
-      <w:proofErr w:type="spellStart"/>
-      <w:r>
-        <w:t>pruebas</w:t>
-      </w:r>
-      <w:proofErr w:type="spellEnd"/>
-      <w:r>
-        <w:t xml:space="preserve"> </w:t>
-      </w:r>
-      <w:proofErr w:type="spellStart"/>
-      <w:r>
-        <w:t>automatizadas</w:t>
-      </w:r>
-      <w:proofErr w:type="spellEnd"/>
     </w:p>
     <w:p>
       <w:pPr>
@@ -17488,21 +17704,7 @@
         <w:rPr>
           <w:rFonts w:cs="Calibri"/>
         </w:rPr>
-        <w:t xml:space="preserve">El plan de </w:t>
-      </w:r>
-      <w:proofErr w:type="spellStart"/>
-      <w:r>
-        <w:rPr>
-          <w:rFonts w:cs="Calibri"/>
-        </w:rPr>
-        <w:t>pruebas</w:t>
-      </w:r>
-      <w:proofErr w:type="spellEnd"/>
-      <w:r>
-        <w:rPr>
-          <w:rFonts w:cs="Calibri"/>
-        </w:rPr>
-        <w:t xml:space="preserve"> se centra en los riesgos principales del sistema: citas inválidas, solapes, errores de calendario, selección numérica de servicios y gestión administrativa de estados. Se priorizan pruebas de servicios porque ahí reside la lógica de negocio.</w:t>
+        <w:t>El plan de pruebas se centra en los riesgos principales del sistema: citas inválidas, solapes, errores de calendario, selección numérica de servicios y gestión administrativa de estados. Se priorizan pruebas de servicios porque ahí reside la lógica de negocio.</w:t>
       </w:r>
     </w:p>
     <w:tbl>
@@ -17837,6 +18039,7 @@
               <w:rPr>
                 <w:rFonts w:cs="Calibri"/>
               </w:rPr>
+              <w:lastRenderedPageBreak/>
               <w:t>npm run check --prefix backend</w:t>
             </w:r>
           </w:p>
@@ -17886,11 +18089,7 @@
         <w:pStyle w:val="Ttulo2"/>
       </w:pPr>
       <w:r>
-        <w:lastRenderedPageBreak/>
-        <w:t>3.</w:t>
-      </w:r>
-      <w:r>
-        <w:t>6</w:t>
+        <w:t>3.6</w:t>
       </w:r>
       <w:r>
         <w:rPr>
@@ -17904,13 +18103,8 @@
         <w:t xml:space="preserve"> </w:t>
       </w:r>
       <w:r>
-        <w:t xml:space="preserve">Dashboard RUP del </w:t>
+        <w:t>Dashboard RUP del proyecto</w:t>
       </w:r>
-      <w:proofErr w:type="spellStart"/>
-      <w:r>
-        <w:t>proyecto</w:t>
-      </w:r>
-      <w:proofErr w:type="spellEnd"/>
     </w:p>
     <w:p>
       <w:pPr>
@@ -17919,47 +18113,11 @@
           <w:rFonts w:cs="Calibri"/>
         </w:rPr>
       </w:pPr>
-      <w:proofErr w:type="spellStart"/>
       <w:r>
         <w:rPr>
           <w:rFonts w:cs="Calibri"/>
         </w:rPr>
-        <w:t>Además</w:t>
-      </w:r>
-      <w:proofErr w:type="spellEnd"/>
-      <w:r>
-        <w:rPr>
-          <w:rFonts w:cs="Calibri"/>
-        </w:rPr>
-        <w:t xml:space="preserve"> de </w:t>
-      </w:r>
-      <w:proofErr w:type="spellStart"/>
-      <w:r>
-        <w:rPr>
-          <w:rFonts w:cs="Calibri"/>
-        </w:rPr>
-        <w:t>los</w:t>
-      </w:r>
-      <w:proofErr w:type="spellEnd"/>
-      <w:r>
-        <w:rPr>
-          <w:rFonts w:cs="Calibri"/>
-        </w:rPr>
-        <w:t xml:space="preserve"> </w:t>
-      </w:r>
-      <w:proofErr w:type="spellStart"/>
-      <w:r>
-        <w:rPr>
-          <w:rFonts w:cs="Calibri"/>
-        </w:rPr>
-        <w:t>diagramas</w:t>
-      </w:r>
-      <w:proofErr w:type="spellEnd"/>
-      <w:r>
-        <w:rPr>
-          <w:rFonts w:cs="Calibri"/>
-        </w:rPr>
-        <w:t xml:space="preserve"> del capítulo, el repositorio incluye un dashboard PlantUML de seguimiento. Este artefacto toma la idea de pySigHor de usar el diagrama de contexto como herramienta de gestión: los casos de uso no solo se dibujan, también se marca su estado de implementación y verificación.</w:t>
+        <w:t>Además de los diagramas del capítulo, el repositorio incluye un dashboard PlantUML de seguimiento. Este artefacto toma la idea de pySigHor de usar el diagrama de contexto como herramienta de gestión: los casos de uso no solo se dibujan, también se marca su estado de implementación y verificación.</w:t>
       </w:r>
     </w:p>
     <w:p>
@@ -18950,7 +19108,7 @@
   <w:style w:type="paragraph" w:default="1" w:styleId="Normal">
     <w:name w:val="Normal"/>
     <w:qFormat/>
-    <w:rsid w:val="007C2246"/>
+    <w:rsid w:val="00CC2119"/>
     <w:pPr>
       <w:spacing w:after="120" w:line="259" w:lineRule="auto"/>
     </w:pPr>
@@ -19172,6 +19330,7 @@
   <w:style w:type="character" w:default="1" w:styleId="Fuentedeprrafopredeter">
     <w:name w:val="Default Paragraph Font"/>
     <w:uiPriority w:val="1"/>
+    <w:semiHidden/>
     <w:unhideWhenUsed/>
   </w:style>
   <w:style w:type="table" w:default="1" w:styleId="Tablanormal">

</xml_diff>